<commit_message>
feat(templates): add Service Location Quality + Terms and Conditions
Append two static end-matter sections to both report templates
(service-location.docx and photo-report.docx):
- "Service location quality" — Categories A-D (Direct / Active / Passive /
  Unverified services location), each with a bold heading and bullet points.
- "Terms and conditions" — the ES liability statement and exclusions list.

Both start on their own page. Generators updated (bullet() helper +
pageBreakBefore support) and a small docx_pack.py unpack/repack utility added
so the letterhead-based templates can be rebuilt. Rendered + visually verified
via LibreOffice; document.xml validated well-formed.
</commit_message>
<xml_diff>
--- a/public/templates/photo-report.docx
+++ b/public/templates/photo-report.docx
@@ -1883,7 +1883,7 @@
         </w:rPr>
       </w:pPr>
       <w:r>
-        <w:t xml:space="preserve">Photo </w:t>
+        <w:t>Photo </w:t>
       </w:r>
       <w:r>
         <w:t>{num}</w:t>
@@ -2438,6 +2438,532 @@
       </w:pPr>
       <w:r>
         <w:t>{/photos}</w:t>
+      </w:r>
+    </w:p>
+    <w:p>
+      <w:pPr>
+        <w:pageBreakBefore/>
+        <w:pBdr>
+          <w:left w:val="single" w:sz="36" w:space="8" w:color="FFC20E"/>
+        </w:pBdr>
+        <w:spacing w:before="220" w:after="90"/>
+        <w:rPr>
+          <w:sz w:val="24"/>
+          <w:szCs w:val="24"/>
+          <w:b/>
+          <w:color w:val="130C0E"/>
+        </w:rPr>
+      </w:pPr>
+      <w:r>
+        <w:rPr>
+          <w:sz w:val="24"/>
+          <w:szCs w:val="24"/>
+          <w:b/>
+          <w:color w:val="130C0E"/>
+        </w:rPr>
+        <w:t xml:space="preserve">Service location quality</w:t>
+      </w:r>
+    </w:p>
+    <w:p>
+      <w:pPr>
+        <w:spacing w:after="0" w:line="252" w:lineRule="auto"/>
+        <w:rPr>
+          <w:sz w:val="21"/>
+          <w:szCs w:val="21"/>
+          <w:b/>
+          <w:color w:val="130C0E"/>
+        </w:rPr>
+      </w:pPr>
+      <w:r>
+        <w:rPr>
+          <w:sz w:val="21"/>
+          <w:szCs w:val="21"/>
+          <w:b/>
+          <w:color w:val="130C0E"/>
+        </w:rPr>
+        <w:t xml:space="preserve">(Category A) Direct Services Location</w:t>
+      </w:r>
+    </w:p>
+    <w:p>
+      <w:pPr>
+        <w:spacing w:after="60" w:line="252" w:lineRule="auto"/>
+        <w:ind w:left="360" w:hanging="220"/>
+        <w:rPr>
+          <w:sz w:val="19"/>
+          <w:szCs w:val="19"/>
+          <w:color w:val="333333"/>
+        </w:rPr>
+      </w:pPr>
+      <w:r>
+        <w:rPr>
+          <w:sz w:val="19"/>
+          <w:szCs w:val="19"/>
+          <w:color w:val="333333"/>
+        </w:rPr>
+        <w:t xml:space="preserve">•  Direct Service location is the highest accuracy order of service location. It refers to services which are openly visible and can be surveyed by direct measurement to the object.</w:t>
+      </w:r>
+    </w:p>
+    <w:p>
+      <w:pPr>
+        <w:spacing w:after="60" w:line="252" w:lineRule="auto"/>
+        <w:ind w:left="360" w:hanging="220"/>
+        <w:rPr>
+          <w:sz w:val="19"/>
+          <w:szCs w:val="19"/>
+          <w:color w:val="333333"/>
+        </w:rPr>
+      </w:pPr>
+      <w:r>
+        <w:rPr>
+          <w:sz w:val="19"/>
+          <w:szCs w:val="19"/>
+          <w:color w:val="333333"/>
+        </w:rPr>
+        <w:t xml:space="preserve">•  Examples include: exposed pipes, open cable trenches and exposed drainage where invert/obvert measurement is possible.</w:t>
+      </w:r>
+    </w:p>
+    <w:p>
+      <w:pPr>
+        <w:spacing w:after="0" w:line="252" w:lineRule="auto"/>
+        <w:rPr>
+          <w:sz w:val="21"/>
+          <w:szCs w:val="21"/>
+          <w:b/>
+          <w:color w:val="130C0E"/>
+        </w:rPr>
+      </w:pPr>
+      <w:r>
+        <w:rPr>
+          <w:sz w:val="21"/>
+          <w:szCs w:val="21"/>
+          <w:b/>
+          <w:color w:val="130C0E"/>
+        </w:rPr>
+        <w:t xml:space="preserve">(Category B) Active Services Location</w:t>
+      </w:r>
+    </w:p>
+    <w:p>
+      <w:pPr>
+        <w:spacing w:after="60" w:line="252" w:lineRule="auto"/>
+        <w:ind w:left="360" w:hanging="220"/>
+        <w:rPr>
+          <w:sz w:val="19"/>
+          <w:szCs w:val="19"/>
+          <w:color w:val="333333"/>
+        </w:rPr>
+      </w:pPr>
+      <w:r>
+        <w:rPr>
+          <w:sz w:val="19"/>
+          <w:szCs w:val="19"/>
+          <w:color w:val="333333"/>
+        </w:rPr>
+        <w:t xml:space="preserve">•  Active Services are to be located using Location methods whereby services are traced using an electromagnetic signal emitted from the transmitter and received by the service detection device.</w:t>
+      </w:r>
+    </w:p>
+    <w:p>
+      <w:pPr>
+        <w:spacing w:after="60" w:line="252" w:lineRule="auto"/>
+        <w:ind w:left="360" w:hanging="220"/>
+        <w:rPr>
+          <w:sz w:val="19"/>
+          <w:szCs w:val="19"/>
+          <w:color w:val="333333"/>
+        </w:rPr>
+      </w:pPr>
+      <w:r>
+        <w:rPr>
+          <w:sz w:val="19"/>
+          <w:szCs w:val="19"/>
+          <w:color w:val="333333"/>
+        </w:rPr>
+        <w:t xml:space="preserve">•  Examples of Active Location methods include using a Direct Connection or Induction Clamp. Readings are required to be marked on the ground surface.</w:t>
+      </w:r>
+    </w:p>
+    <w:p>
+      <w:pPr>
+        <w:spacing w:after="60" w:line="252" w:lineRule="auto"/>
+        <w:ind w:left="360" w:hanging="220"/>
+        <w:rPr>
+          <w:sz w:val="19"/>
+          <w:szCs w:val="19"/>
+          <w:color w:val="333333"/>
+        </w:rPr>
+      </w:pPr>
+      <w:r>
+        <w:rPr>
+          <w:sz w:val="19"/>
+          <w:szCs w:val="19"/>
+          <w:color w:val="333333"/>
+        </w:rPr>
+        <w:t xml:space="preserve">•  Active Location methods are suitable for metal conduits, cables that are welded, soldered, or braided together or where a tracing wire/cathodic protection is present. This method is mandatory for rail services.</w:t>
+      </w:r>
+    </w:p>
+    <w:p>
+      <w:pPr>
+        <w:spacing w:after="0" w:line="252" w:lineRule="auto"/>
+        <w:rPr>
+          <w:sz w:val="21"/>
+          <w:szCs w:val="21"/>
+          <w:b/>
+          <w:color w:val="130C0E"/>
+        </w:rPr>
+      </w:pPr>
+      <w:r>
+        <w:rPr>
+          <w:sz w:val="21"/>
+          <w:szCs w:val="21"/>
+          <w:b/>
+          <w:color w:val="130C0E"/>
+        </w:rPr>
+        <w:t xml:space="preserve">(Category C) Passive Services Location</w:t>
+      </w:r>
+    </w:p>
+    <w:p>
+      <w:pPr>
+        <w:spacing w:after="60" w:line="252" w:lineRule="auto"/>
+        <w:ind w:left="360" w:hanging="220"/>
+        <w:rPr>
+          <w:sz w:val="19"/>
+          <w:szCs w:val="19"/>
+          <w:color w:val="333333"/>
+        </w:rPr>
+      </w:pPr>
+      <w:r>
+        <w:rPr>
+          <w:sz w:val="19"/>
+          <w:szCs w:val="19"/>
+          <w:color w:val="333333"/>
+        </w:rPr>
+        <w:t xml:space="preserve">•  Passive Services Location uses passive methods which do not involve the use of an electromagnetic signal, transponders, or sondes. In this class the service detection device is used as a standalone.</w:t>
+      </w:r>
+    </w:p>
+    <w:p>
+      <w:pPr>
+        <w:spacing w:after="60" w:line="252" w:lineRule="auto"/>
+        <w:ind w:left="360" w:hanging="220"/>
+        <w:rPr>
+          <w:sz w:val="19"/>
+          <w:szCs w:val="19"/>
+          <w:color w:val="333333"/>
+        </w:rPr>
+      </w:pPr>
+      <w:r>
+        <w:rPr>
+          <w:sz w:val="19"/>
+          <w:szCs w:val="19"/>
+          <w:color w:val="333333"/>
+        </w:rPr>
+        <w:t xml:space="preserve">•  Examples of Passive Service Location capture include radiolocation or GPR. These methods are commonly used for materials such as cast iron or steel pipes where active induction is not possible. Readings are required to be marked on the ground surface.</w:t>
+      </w:r>
+    </w:p>
+    <w:p>
+      <w:pPr>
+        <w:spacing w:after="0" w:line="252" w:lineRule="auto"/>
+        <w:rPr>
+          <w:sz w:val="21"/>
+          <w:szCs w:val="21"/>
+          <w:b/>
+          <w:color w:val="130C0E"/>
+        </w:rPr>
+      </w:pPr>
+      <w:r>
+        <w:rPr>
+          <w:sz w:val="21"/>
+          <w:szCs w:val="21"/>
+          <w:b/>
+          <w:color w:val="130C0E"/>
+        </w:rPr>
+        <w:t xml:space="preserve">(Category D) Unverified Services Location</w:t>
+      </w:r>
+    </w:p>
+    <w:p>
+      <w:pPr>
+        <w:spacing w:after="60" w:line="252" w:lineRule="auto"/>
+        <w:ind w:left="360" w:hanging="220"/>
+        <w:rPr>
+          <w:sz w:val="19"/>
+          <w:szCs w:val="19"/>
+          <w:color w:val="333333"/>
+        </w:rPr>
+      </w:pPr>
+      <w:r>
+        <w:rPr>
+          <w:sz w:val="19"/>
+          <w:szCs w:val="19"/>
+          <w:color w:val="333333"/>
+        </w:rPr>
+        <w:t xml:space="preserve">•  Unverified Services are services that have been located without confirmation by any of the above-mentioned methods. Unverified Services can include service locations approximated from DBYD plans or by joining top stones. The resulting services will be determined as unverified services.</w:t>
+      </w:r>
+    </w:p>
+    <w:p>
+      <w:pPr>
+        <w:spacing w:after="60" w:line="252" w:lineRule="auto"/>
+        <w:ind w:left="360" w:hanging="220"/>
+        <w:rPr>
+          <w:sz w:val="19"/>
+          <w:szCs w:val="19"/>
+          <w:color w:val="333333"/>
+        </w:rPr>
+      </w:pPr>
+      <w:r>
+        <w:rPr>
+          <w:sz w:val="19"/>
+          <w:szCs w:val="19"/>
+          <w:color w:val="333333"/>
+        </w:rPr>
+        <w:t xml:space="preserve">•  Unverified location methods are commonly used for materials such as plastic poly tubing, clay, concrete, or uninsulated/rubber jointed cast iron pipes where other methods are not possible.</w:t>
+      </w:r>
+    </w:p>
+    <w:p>
+      <w:pPr>
+        <w:pBdr>
+          <w:left w:val="single" w:sz="36" w:space="8" w:color="FFC20E"/>
+        </w:pBdr>
+        <w:spacing w:before="220" w:after="90"/>
+        <w:rPr>
+          <w:sz w:val="24"/>
+          <w:szCs w:val="24"/>
+          <w:b/>
+          <w:color w:val="130C0E"/>
+        </w:rPr>
+      </w:pPr>
+      <w:r>
+        <w:rPr>
+          <w:sz w:val="24"/>
+          <w:szCs w:val="24"/>
+          <w:b/>
+          <w:color w:val="130C0E"/>
+        </w:rPr>
+        <w:t xml:space="preserve">Terms and conditions</w:t>
+      </w:r>
+    </w:p>
+    <w:p>
+      <w:pPr>
+        <w:spacing w:after="0" w:line="252" w:lineRule="auto"/>
+        <w:rPr>
+          <w:sz w:val="20"/>
+          <w:szCs w:val="20"/>
+          <w:color w:val="130C0E"/>
+        </w:rPr>
+      </w:pPr>
+      <w:r>
+        <w:rPr>
+          <w:sz w:val="20"/>
+          <w:szCs w:val="20"/>
+          <w:color w:val="130C0E"/>
+        </w:rPr>
+        <w:t xml:space="preserve">Engineering Surveys accepts no responsibility for damage occurring to Underground services, other than as a direct result of its negligence. All Engineering Surveys employees undertake regular Training and compliance with industry standards.</w:t>
+      </w:r>
+    </w:p>
+    <w:p>
+      <w:pPr>
+        <w:spacing w:after="0" w:line="252" w:lineRule="auto"/>
+        <w:rPr>
+          <w:sz w:val="20"/>
+          <w:szCs w:val="20"/>
+          <w:b/>
+          <w:color w:val="130C0E"/>
+        </w:rPr>
+      </w:pPr>
+      <w:r>
+        <w:rPr>
+          <w:sz w:val="20"/>
+          <w:szCs w:val="20"/>
+          <w:b/>
+          <w:color w:val="130C0E"/>
+        </w:rPr>
+        <w:t xml:space="preserve">Engineering Surveys will not accept responsibility for damage under the following:</w:t>
+      </w:r>
+    </w:p>
+    <w:p>
+      <w:pPr>
+        <w:spacing w:after="60" w:line="252" w:lineRule="auto"/>
+        <w:ind w:left="360" w:hanging="220"/>
+        <w:rPr>
+          <w:sz w:val="19"/>
+          <w:szCs w:val="19"/>
+          <w:color w:val="333333"/>
+        </w:rPr>
+      </w:pPr>
+      <w:r>
+        <w:rPr>
+          <w:sz w:val="19"/>
+          <w:szCs w:val="19"/>
+          <w:color w:val="333333"/>
+        </w:rPr>
+        <w:t xml:space="preserve">•  Damage to any services outside the area designated by the client, as is the entire area in which work will be carried out, and/or</w:t>
+      </w:r>
+    </w:p>
+    <w:p>
+      <w:pPr>
+        <w:spacing w:after="60" w:line="252" w:lineRule="auto"/>
+        <w:ind w:left="360" w:hanging="220"/>
+        <w:rPr>
+          <w:sz w:val="19"/>
+          <w:szCs w:val="19"/>
+          <w:color w:val="333333"/>
+        </w:rPr>
+      </w:pPr>
+      <w:r>
+        <w:rPr>
+          <w:sz w:val="19"/>
+          <w:szCs w:val="19"/>
+          <w:color w:val="333333"/>
+        </w:rPr>
+        <w:t xml:space="preserve">•  Damage to any service which has not been indicated, or incorrectly indicated on plans obtained through dial before you dig, or from any other source, and/or</w:t>
+      </w:r>
+    </w:p>
+    <w:p>
+      <w:pPr>
+        <w:spacing w:after="60" w:line="252" w:lineRule="auto"/>
+        <w:ind w:left="360" w:hanging="220"/>
+        <w:rPr>
+          <w:sz w:val="19"/>
+          <w:szCs w:val="19"/>
+          <w:color w:val="333333"/>
+        </w:rPr>
+      </w:pPr>
+      <w:r>
+        <w:rPr>
+          <w:sz w:val="19"/>
+          <w:szCs w:val="19"/>
+          <w:color w:val="333333"/>
+        </w:rPr>
+        <w:t xml:space="preserve">•  Where the spray marker is no longer visible/legible, and/or</w:t>
+      </w:r>
+    </w:p>
+    <w:p>
+      <w:pPr>
+        <w:spacing w:after="60" w:line="252" w:lineRule="auto"/>
+        <w:ind w:left="360" w:hanging="220"/>
+        <w:rPr>
+          <w:sz w:val="19"/>
+          <w:szCs w:val="19"/>
+          <w:color w:val="333333"/>
+        </w:rPr>
+      </w:pPr>
+      <w:r>
+        <w:rPr>
+          <w:sz w:val="19"/>
+          <w:szCs w:val="19"/>
+          <w:color w:val="333333"/>
+        </w:rPr>
+        <w:t xml:space="preserve">•  Failure by the client to physically expose (by non-destructive potholing methods) any marked services to confirm alignment and depth. Refer to affected asset owners ‘Duty of care’ for safe approach distance requirements, and/or</w:t>
+      </w:r>
+    </w:p>
+    <w:p>
+      <w:pPr>
+        <w:spacing w:after="60" w:line="252" w:lineRule="auto"/>
+        <w:ind w:left="360" w:hanging="220"/>
+        <w:rPr>
+          <w:sz w:val="19"/>
+          <w:szCs w:val="19"/>
+          <w:color w:val="333333"/>
+        </w:rPr>
+      </w:pPr>
+      <w:r>
+        <w:rPr>
+          <w:sz w:val="19"/>
+          <w:szCs w:val="19"/>
+          <w:color w:val="333333"/>
+        </w:rPr>
+        <w:t xml:space="preserve">•  Non-conductive services are not detectable with equipment currently available. No responsibility is taken for any damage incurred to any non-conductive services (i.e. poly, pvc, concrete, and earthenware etc.), and/or</w:t>
+      </w:r>
+    </w:p>
+    <w:p>
+      <w:pPr>
+        <w:spacing w:after="60" w:line="252" w:lineRule="auto"/>
+        <w:ind w:left="360" w:hanging="220"/>
+        <w:rPr>
+          <w:sz w:val="19"/>
+          <w:szCs w:val="19"/>
+          <w:color w:val="333333"/>
+        </w:rPr>
+      </w:pPr>
+      <w:r>
+        <w:rPr>
+          <w:sz w:val="19"/>
+          <w:szCs w:val="19"/>
+          <w:color w:val="333333"/>
+        </w:rPr>
+        <w:t xml:space="preserve">•  Where no visible signs or reasonable access to a conductive service is known, and/or</w:t>
+      </w:r>
+    </w:p>
+    <w:p>
+      <w:pPr>
+        <w:spacing w:after="60" w:line="252" w:lineRule="auto"/>
+        <w:ind w:left="360" w:hanging="220"/>
+        <w:rPr>
+          <w:sz w:val="19"/>
+          <w:szCs w:val="19"/>
+          <w:color w:val="333333"/>
+        </w:rPr>
+      </w:pPr>
+      <w:r>
+        <w:rPr>
+          <w:sz w:val="19"/>
+          <w:szCs w:val="19"/>
+          <w:color w:val="333333"/>
+        </w:rPr>
+        <w:t xml:space="preserve">•  If conductive continuity is not maintained through the service being located.</w:t>
+      </w:r>
+    </w:p>
+    <w:p>
+      <w:pPr>
+        <w:spacing w:after="60" w:line="252" w:lineRule="auto"/>
+        <w:ind w:left="360" w:hanging="220"/>
+        <w:rPr>
+          <w:sz w:val="19"/>
+          <w:szCs w:val="19"/>
+          <w:color w:val="333333"/>
+        </w:rPr>
+      </w:pPr>
+      <w:r>
+        <w:rPr>
+          <w:sz w:val="19"/>
+          <w:szCs w:val="19"/>
+          <w:color w:val="333333"/>
+        </w:rPr>
+        <w:t xml:space="preserve">•  Engineering Surveys accepts no responsibility for damage to services that have not been verified by ‘potholing’. In the event of damage to services:</w:t>
+      </w:r>
+    </w:p>
+    <w:p>
+      <w:pPr>
+        <w:spacing w:after="60" w:line="252" w:lineRule="auto"/>
+        <w:ind w:left="360" w:hanging="220"/>
+        <w:rPr>
+          <w:sz w:val="19"/>
+          <w:szCs w:val="19"/>
+          <w:color w:val="333333"/>
+        </w:rPr>
+      </w:pPr>
+      <w:r>
+        <w:rPr>
+          <w:sz w:val="19"/>
+          <w:szCs w:val="19"/>
+          <w:color w:val="333333"/>
+        </w:rPr>
+        <w:t xml:space="preserve">•  All damage must be reported to Engineering Surveys prior to any repairs occurring, and/or further earthworks being conducted.</w:t>
+      </w:r>
+    </w:p>
+    <w:p>
+      <w:pPr>
+        <w:spacing w:after="60" w:line="252" w:lineRule="auto"/>
+        <w:ind w:left="360" w:hanging="220"/>
+        <w:rPr>
+          <w:sz w:val="19"/>
+          <w:szCs w:val="19"/>
+          <w:color w:val="333333"/>
+        </w:rPr>
+      </w:pPr>
+      <w:r>
+        <w:rPr>
+          <w:sz w:val="19"/>
+          <w:szCs w:val="19"/>
+          <w:color w:val="333333"/>
+        </w:rPr>
+        <w:t xml:space="preserve">•  An Engineering Surveys representative is to carry out site inspection within a reasonable time period that will not delay necessary repair work.</w:t>
       </w:r>
     </w:p>
     <w:sectPr>

</xml_diff>

<commit_message>
build(templates): finalize photo-report.docx (colour scheme + new codes + pothole grid)
</commit_message>
<xml_diff>
--- a/public/templates/photo-report.docx
+++ b/public/templates/photo-report.docx
@@ -1021,14 +1021,14 @@
         </w:tblBorders>
       </w:tblPr>
       <w:tblGrid>
-        <w:gridCol w:w="1400"/>
-        <w:gridCol w:w="8686"/>
+        <w:gridCol w:w="1900"/>
+        <w:gridCol w:w="8186"/>
       </w:tblGrid>
       <w:tr>
         <w:tc>
           <w:tcPr>
-            <w:tcW w:w="1400" w:type="dxa"/>
-            <w:shd w:val="clear" w:color="auto" w:fill="F5A623"/>
+            <w:tcW w:w="1900" w:type="dxa"/>
+            <w:shd w:val="clear" w:color="auto" w:fill="F6E84F"/>
             <w:tcMar>
               <w:top w:w="40" w:type="dxa"/>
               <w:left w:w="110" w:type="dxa"/>
@@ -1055,13 +1055,13 @@
                 <w:b/>
                 <w:color w:val="000000"/>
               </w:rPr>
-              <w:t xml:space="preserve">G</w:t>
-            </w:r>
-          </w:p>
-        </w:tc>
-        <w:tc>
-          <w:tcPr>
-            <w:tcW w:w="8686" w:type="dxa"/>
+              <w:t xml:space="preserve">G, GM, GS</w:t>
+            </w:r>
+          </w:p>
+        </w:tc>
+        <w:tc>
+          <w:tcPr>
+            <w:tcW w:w="8186" w:type="dxa"/>
             <w:tcMar>
               <w:top w:w="40" w:type="dxa"/>
               <w:left w:w="110" w:type="dxa"/>
@@ -1093,8 +1093,8 @@
       <w:tr>
         <w:tc>
           <w:tcPr>
-            <w:tcW w:w="1400" w:type="dxa"/>
-            <w:shd w:val="clear" w:color="auto" w:fill="FF7F00"/>
+            <w:tcW w:w="1900" w:type="dxa"/>
+            <w:shd w:val="clear" w:color="auto" w:fill="FFFFFF"/>
             <w:tcMar>
               <w:top w:w="40" w:type="dxa"/>
               <w:left w:w="110" w:type="dxa"/>
@@ -1127,7 +1127,7 @@
         </w:tc>
         <w:tc>
           <w:tcPr>
-            <w:tcW w:w="8686" w:type="dxa"/>
+            <w:tcW w:w="8186" w:type="dxa"/>
             <w:tcMar>
               <w:top w:w="40" w:type="dxa"/>
               <w:left w:w="110" w:type="dxa"/>
@@ -1159,8 +1159,8 @@
       <w:tr>
         <w:tc>
           <w:tcPr>
-            <w:tcW w:w="1400" w:type="dxa"/>
-            <w:shd w:val="clear" w:color="auto" w:fill="FF0000"/>
+            <w:tcW w:w="1900" w:type="dxa"/>
+            <w:shd w:val="clear" w:color="auto" w:fill="F4B183"/>
             <w:tcMar>
               <w:top w:w="40" w:type="dxa"/>
               <w:left w:w="110" w:type="dxa"/>
@@ -1177,23 +1177,23 @@
                 <w:sz w:val="20"/>
                 <w:szCs w:val="20"/>
                 <w:b/>
-                <w:color w:val="FFFFFF"/>
-              </w:rPr>
-            </w:pPr>
-            <w:r>
-              <w:rPr>
-                <w:sz w:val="20"/>
-                <w:szCs w:val="20"/>
-                <w:b/>
-                <w:color w:val="FFFFFF"/>
-              </w:rPr>
-              <w:t xml:space="preserve">E</w:t>
-            </w:r>
-          </w:p>
-        </w:tc>
-        <w:tc>
-          <w:tcPr>
-            <w:tcW w:w="8686" w:type="dxa"/>
+                <w:color w:val="000000"/>
+              </w:rPr>
+            </w:pPr>
+            <w:r>
+              <w:rPr>
+                <w:sz w:val="20"/>
+                <w:szCs w:val="20"/>
+                <w:b/>
+                <w:color w:val="000000"/>
+              </w:rPr>
+              <w:t xml:space="preserve">HV, LV, E</w:t>
+            </w:r>
+          </w:p>
+        </w:tc>
+        <w:tc>
+          <w:tcPr>
+            <w:tcW w:w="8186" w:type="dxa"/>
             <w:tcMar>
               <w:top w:w="40" w:type="dxa"/>
               <w:left w:w="110" w:type="dxa"/>
@@ -1225,8 +1225,8 @@
       <w:tr>
         <w:tc>
           <w:tcPr>
-            <w:tcW w:w="1400" w:type="dxa"/>
-            <w:shd w:val="clear" w:color="auto" w:fill="D9D9D9"/>
+            <w:tcW w:w="1900" w:type="dxa"/>
+            <w:shd w:val="clear" w:color="auto" w:fill="FFFFFF"/>
             <w:tcMar>
               <w:top w:w="40" w:type="dxa"/>
               <w:left w:w="110" w:type="dxa"/>
@@ -1253,13 +1253,13 @@
                 <w:b/>
                 <w:color w:val="000000"/>
               </w:rPr>
-              <w:t xml:space="preserve">COMMS</w:t>
-            </w:r>
-          </w:p>
-        </w:tc>
-        <w:tc>
-          <w:tcPr>
-            <w:tcW w:w="8686" w:type="dxa"/>
+              <w:t xml:space="preserve">COMMS, OF</w:t>
+            </w:r>
+          </w:p>
+        </w:tc>
+        <w:tc>
+          <w:tcPr>
+            <w:tcW w:w="8186" w:type="dxa"/>
             <w:tcMar>
               <w:top w:w="40" w:type="dxa"/>
               <w:left w:w="110" w:type="dxa"/>
@@ -1291,8 +1291,8 @@
       <w:tr>
         <w:tc>
           <w:tcPr>
-            <w:tcW w:w="1400" w:type="dxa"/>
-            <w:shd w:val="clear" w:color="auto" w:fill="0000FF"/>
+            <w:tcW w:w="1900" w:type="dxa"/>
+            <w:shd w:val="clear" w:color="auto" w:fill="8EAADB"/>
             <w:tcMar>
               <w:top w:w="40" w:type="dxa"/>
               <w:left w:w="110" w:type="dxa"/>
@@ -1309,23 +1309,23 @@
                 <w:sz w:val="20"/>
                 <w:szCs w:val="20"/>
                 <w:b/>
-                <w:color w:val="FFFFFF"/>
-              </w:rPr>
-            </w:pPr>
-            <w:r>
-              <w:rPr>
-                <w:sz w:val="20"/>
-                <w:szCs w:val="20"/>
-                <w:b/>
-                <w:color w:val="FFFFFF"/>
-              </w:rPr>
-              <w:t xml:space="preserve">W</w:t>
-            </w:r>
-          </w:p>
-        </w:tc>
-        <w:tc>
-          <w:tcPr>
-            <w:tcW w:w="8686" w:type="dxa"/>
+                <w:color w:val="000000"/>
+              </w:rPr>
+            </w:pPr>
+            <w:r>
+              <w:rPr>
+                <w:sz w:val="20"/>
+                <w:szCs w:val="20"/>
+                <w:b/>
+                <w:color w:val="000000"/>
+              </w:rPr>
+              <w:t xml:space="preserve">WS, WM, W</w:t>
+            </w:r>
+          </w:p>
+        </w:tc>
+        <w:tc>
+          <w:tcPr>
+            <w:tcW w:w="8186" w:type="dxa"/>
             <w:tcMar>
               <w:top w:w="40" w:type="dxa"/>
               <w:left w:w="110" w:type="dxa"/>
@@ -1357,8 +1357,8 @@
       <w:tr>
         <w:tc>
           <w:tcPr>
-            <w:tcW w:w="1400" w:type="dxa"/>
-            <w:shd w:val="clear" w:color="auto" w:fill="00A651"/>
+            <w:tcW w:w="1900" w:type="dxa"/>
+            <w:shd w:val="clear" w:color="auto" w:fill="FBE4D5"/>
             <w:tcMar>
               <w:top w:w="40" w:type="dxa"/>
               <w:left w:w="110" w:type="dxa"/>
@@ -1375,15 +1375,15 @@
                 <w:sz w:val="20"/>
                 <w:szCs w:val="20"/>
                 <w:b/>
-                <w:color w:val="FFFFFF"/>
-              </w:rPr>
-            </w:pPr>
-            <w:r>
-              <w:rPr>
-                <w:sz w:val="20"/>
-                <w:szCs w:val="20"/>
-                <w:b/>
-                <w:color w:val="FFFFFF"/>
+                <w:color w:val="000000"/>
+              </w:rPr>
+            </w:pPr>
+            <w:r>
+              <w:rPr>
+                <w:sz w:val="20"/>
+                <w:szCs w:val="20"/>
+                <w:b/>
+                <w:color w:val="000000"/>
               </w:rPr>
               <w:t xml:space="preserve">SWR</w:t>
             </w:r>
@@ -1391,7 +1391,7 @@
         </w:tc>
         <w:tc>
           <w:tcPr>
-            <w:tcW w:w="8686" w:type="dxa"/>
+            <w:tcW w:w="8186" w:type="dxa"/>
             <w:tcMar>
               <w:top w:w="40" w:type="dxa"/>
               <w:left w:w="110" w:type="dxa"/>
@@ -1423,8 +1423,8 @@
       <w:tr>
         <w:tc>
           <w:tcPr>
-            <w:tcW w:w="1400" w:type="dxa"/>
-            <w:shd w:val="clear" w:color="auto" w:fill="7030A0"/>
+            <w:tcW w:w="1900" w:type="dxa"/>
+            <w:shd w:val="clear" w:color="auto" w:fill="92D050"/>
             <w:tcMar>
               <w:top w:w="40" w:type="dxa"/>
               <w:left w:w="110" w:type="dxa"/>
@@ -1441,15 +1441,15 @@
                 <w:sz w:val="20"/>
                 <w:szCs w:val="20"/>
                 <w:b/>
-                <w:color w:val="FFFFFF"/>
-              </w:rPr>
-            </w:pPr>
-            <w:r>
-              <w:rPr>
-                <w:sz w:val="20"/>
-                <w:szCs w:val="20"/>
-                <w:b/>
-                <w:color w:val="FFFFFF"/>
+                <w:color w:val="000000"/>
+              </w:rPr>
+            </w:pPr>
+            <w:r>
+              <w:rPr>
+                <w:sz w:val="20"/>
+                <w:szCs w:val="20"/>
+                <w:b/>
+                <w:color w:val="000000"/>
               </w:rPr>
               <w:t xml:space="preserve">STW</w:t>
             </w:r>
@@ -1457,7 +1457,7 @@
         </w:tc>
         <w:tc>
           <w:tcPr>
-            <w:tcW w:w="8686" w:type="dxa"/>
+            <w:tcW w:w="8186" w:type="dxa"/>
             <w:tcMar>
               <w:top w:w="40" w:type="dxa"/>
               <w:left w:w="110" w:type="dxa"/>
@@ -1489,8 +1489,8 @@
       <w:tr>
         <w:tc>
           <w:tcPr>
-            <w:tcW w:w="1400" w:type="dxa"/>
-            <w:shd w:val="clear" w:color="auto" w:fill="7030A0"/>
+            <w:tcW w:w="1900" w:type="dxa"/>
+            <w:shd w:val="clear" w:color="auto" w:fill="D777C5"/>
             <w:tcMar>
               <w:top w:w="40" w:type="dxa"/>
               <w:left w:w="110" w:type="dxa"/>
@@ -1507,15 +1507,15 @@
                 <w:sz w:val="20"/>
                 <w:szCs w:val="20"/>
                 <w:b/>
-                <w:color w:val="FFFFFF"/>
-              </w:rPr>
-            </w:pPr>
-            <w:r>
-              <w:rPr>
-                <w:sz w:val="20"/>
-                <w:szCs w:val="20"/>
-                <w:b/>
-                <w:color w:val="FFFFFF"/>
+                <w:color w:val="000000"/>
+              </w:rPr>
+            </w:pPr>
+            <w:r>
+              <w:rPr>
+                <w:sz w:val="20"/>
+                <w:szCs w:val="20"/>
+                <w:b/>
+                <w:color w:val="000000"/>
               </w:rPr>
               <w:t xml:space="preserve">RW</w:t>
             </w:r>
@@ -1523,7 +1523,7 @@
         </w:tc>
         <w:tc>
           <w:tcPr>
-            <w:tcW w:w="8686" w:type="dxa"/>
+            <w:tcW w:w="8186" w:type="dxa"/>
             <w:tcMar>
               <w:top w:w="40" w:type="dxa"/>
               <w:left w:w="110" w:type="dxa"/>
@@ -1555,8 +1555,8 @@
       <w:tr>
         <w:tc>
           <w:tcPr>
-            <w:tcW w:w="1400" w:type="dxa"/>
-            <w:shd w:val="clear" w:color="auto" w:fill="FF66CC"/>
+            <w:tcW w:w="1900" w:type="dxa"/>
+            <w:shd w:val="clear" w:color="auto" w:fill="FF3399"/>
             <w:tcMar>
               <w:top w:w="40" w:type="dxa"/>
               <w:left w:w="110" w:type="dxa"/>
@@ -1589,7 +1589,7 @@
         </w:tc>
         <w:tc>
           <w:tcPr>
-            <w:tcW w:w="8686" w:type="dxa"/>
+            <w:tcW w:w="8186" w:type="dxa"/>
             <w:tcMar>
               <w:top w:w="40" w:type="dxa"/>
               <w:left w:w="110" w:type="dxa"/>
@@ -1621,7 +1621,7 @@
       <w:tr>
         <w:tc>
           <w:tcPr>
-            <w:tcW w:w="1400" w:type="dxa"/>
+            <w:tcW w:w="1900" w:type="dxa"/>
             <w:shd w:val="clear" w:color="auto" w:fill="FFFF00"/>
             <w:tcMar>
               <w:top w:w="40" w:type="dxa"/>
@@ -1655,7 +1655,7 @@
         </w:tc>
         <w:tc>
           <w:tcPr>
-            <w:tcW w:w="8686" w:type="dxa"/>
+            <w:tcW w:w="8186" w:type="dxa"/>
             <w:tcMar>
               <w:top w:w="40" w:type="dxa"/>
               <w:left w:w="110" w:type="dxa"/>

</xml_diff>

<commit_message>
feat(pothole-report): utilities-located as a Service-style table
Replace the Photo report cover's inline "Utilities located" list +
"Located to quality level" line with a single checklist table identical in
shape to the Service report: one fixed, colour-coded row per utility with
Service | Quality | Comment columns. This table is now the source of truth
for utilities located.

- build-photo-report-template.py: fixed util table with {<key>_quality} /
  {<key>_comment} tags per utility (keys added to UTILS); dropped the
  {#utilities} loop and {qlLevels}.
- photoReportDocxService.js: buildData emits per-utility quality/comment tags
  from job.utilData (dropped the utilities loop + qlLevels; removed now-unused
  legendColors import).
- PhotoReport.js: checklist gains a Comment column; buildReport sends utilData
  (quality string + comment per utility). Quick-fill updated.

Rendered end-to-end + previewed (cover table fills correctly); build clean.
</commit_message>
<xml_diff>
--- a/public/templates/photo-report.docx
+++ b/public/templates/photo-report.docx
@@ -777,88 +777,1085 @@
         <w:t xml:space="preserve">Utilities located</w:t>
       </w:r>
     </w:p>
-    <w:p>
-      <w:pPr>
-        <w:spacing w:after="0"/>
-        <w:rPr>
-          <w:sz w:val="21"/>
-          <w:szCs w:val="21"/>
-          <w:color w:val="130C0E"/>
-        </w:rPr>
-      </w:pPr>
-      <w:r>
-        <w:t>{#utilities}</w:t>
-      </w:r>
-      <w:r>
-        <w:rPr>
-          <w:sz w:val="21"/>
-          <w:szCs w:val="21"/>
-          <w:b/>
-          <w:color w:val="130C0E"/>
-        </w:rPr>
-        <w:t xml:space="preserve">{label}</w:t>
-      </w:r>
-      <w:r>
-        <w:rPr>
-          <w:sz w:val="21"/>
-          <w:szCs w:val="21"/>
-          <w:color w:val="130C0E"/>
-        </w:rPr>
-        <w:t xml:space="preserve">    </w:t>
-      </w:r>
-      <w:r>
-        <w:t>{/utilities}</w:t>
-      </w:r>
-      <w:r>
-        <w:rPr>
-          <w:sz w:val="21"/>
-          <w:szCs w:val="21"/>
-          <w:color w:val="888888"/>
-        </w:rPr>
-        <w:t>{^utilities}None recorded.{/utilities}</w:t>
-      </w:r>
-    </w:p>
-    <w:p>
-      <w:pPr>
-        <w:pBdr>
-          <w:left w:val="single" w:sz="36" w:space="8" w:color="FFC20E"/>
-        </w:pBdr>
-        <w:spacing w:before="220" w:after="90"/>
-        <w:rPr>
-          <w:sz w:val="24"/>
-          <w:szCs w:val="24"/>
-          <w:b/>
-          <w:color w:val="130C0E"/>
-        </w:rPr>
-      </w:pPr>
-      <w:r>
-        <w:rPr>
-          <w:sz w:val="24"/>
-          <w:szCs w:val="24"/>
-          <w:b/>
-          <w:color w:val="130C0E"/>
-        </w:rPr>
-        <w:t xml:space="preserve">Located to quality level (AS 5488.1:2022)</w:t>
-      </w:r>
-    </w:p>
-    <w:p>
-      <w:pPr>
-        <w:spacing w:after="0" w:line="252" w:lineRule="auto"/>
-        <w:rPr>
-          <w:sz w:val="20"/>
-          <w:szCs w:val="20"/>
-          <w:color w:val="130C0E"/>
-        </w:rPr>
-      </w:pPr>
-      <w:r>
-        <w:rPr>
-          <w:sz w:val="20"/>
-          <w:szCs w:val="20"/>
-          <w:color w:val="130C0E"/>
-        </w:rPr>
-        <w:t xml:space="preserve">{qlLevels}</w:t>
-      </w:r>
-    </w:p>
+    <w:tbl>
+      <w:tblPr>
+        <w:tblW w:w="10086" w:type="dxa"/>
+        <w:jc w:val="left"/>
+        <w:tblInd w:w="0" w:type="dxa"/>
+        <w:tblBorders>
+          <w:top w:val="single" w:sz="4" w:space="0" w:color="E6E3DD"/>
+          <w:left w:val="single" w:sz="4" w:space="0" w:color="E6E3DD"/>
+          <w:bottom w:val="single" w:sz="4" w:space="0" w:color="E6E3DD"/>
+          <w:right w:val="single" w:sz="4" w:space="0" w:color="E6E3DD"/>
+          <w:insideH w:val="single" w:sz="4" w:space="0" w:color="E6E3DD"/>
+          <w:insideV w:val="single" w:sz="4" w:space="0" w:color="E6E3DD"/>
+        </w:tblBorders>
+      </w:tblPr>
+      <w:tblGrid>
+        <w:gridCol w:w="3400"/>
+        <w:gridCol w:w="1700"/>
+        <w:gridCol w:w="4986"/>
+      </w:tblGrid>
+      <w:tr>
+        <w:tc>
+          <w:tcPr>
+            <w:tcW w:w="3400" w:type="dxa"/>
+            <w:shd w:val="clear" w:color="auto" w:fill="130C0E"/>
+            <w:tcMar>
+              <w:top w:w="40" w:type="dxa"/>
+              <w:left w:w="110" w:type="dxa"/>
+              <w:bottom w:w="40" w:type="dxa"/>
+              <w:right w:w="110" w:type="dxa"/>
+            </w:tcMar>
+            <w:vAlign w:val="center"/>
+          </w:tcPr>
+          <w:p>
+            <w:pPr>
+              <w:spacing w:after="0" w:line="252" w:lineRule="auto"/>
+              <w:rPr>
+                <w:sz w:val="20"/>
+                <w:szCs w:val="20"/>
+                <w:b/>
+                <w:color w:val="FFFFFF"/>
+              </w:rPr>
+            </w:pPr>
+            <w:r>
+              <w:rPr>
+                <w:sz w:val="20"/>
+                <w:szCs w:val="20"/>
+                <w:b/>
+                <w:color w:val="FFFFFF"/>
+              </w:rPr>
+              <w:t xml:space="preserve">Service</w:t>
+            </w:r>
+          </w:p>
+        </w:tc>
+        <w:tc>
+          <w:tcPr>
+            <w:tcW w:w="1700" w:type="dxa"/>
+            <w:shd w:val="clear" w:color="auto" w:fill="130C0E"/>
+            <w:tcMar>
+              <w:top w:w="40" w:type="dxa"/>
+              <w:left w:w="110" w:type="dxa"/>
+              <w:bottom w:w="40" w:type="dxa"/>
+              <w:right w:w="110" w:type="dxa"/>
+            </w:tcMar>
+            <w:vAlign w:val="center"/>
+          </w:tcPr>
+          <w:p>
+            <w:pPr>
+              <w:spacing w:after="0" w:line="252" w:lineRule="auto"/>
+              <w:rPr>
+                <w:sz w:val="20"/>
+                <w:szCs w:val="20"/>
+                <w:b/>
+                <w:color w:val="FFFFFF"/>
+              </w:rPr>
+            </w:pPr>
+            <w:r>
+              <w:rPr>
+                <w:sz w:val="20"/>
+                <w:szCs w:val="20"/>
+                <w:b/>
+                <w:color w:val="FFFFFF"/>
+              </w:rPr>
+              <w:t xml:space="preserve">Quality</w:t>
+            </w:r>
+          </w:p>
+        </w:tc>
+        <w:tc>
+          <w:tcPr>
+            <w:tcW w:w="4986" w:type="dxa"/>
+            <w:shd w:val="clear" w:color="auto" w:fill="130C0E"/>
+            <w:tcMar>
+              <w:top w:w="40" w:type="dxa"/>
+              <w:left w:w="110" w:type="dxa"/>
+              <w:bottom w:w="40" w:type="dxa"/>
+              <w:right w:w="110" w:type="dxa"/>
+            </w:tcMar>
+            <w:vAlign w:val="center"/>
+          </w:tcPr>
+          <w:p>
+            <w:pPr>
+              <w:spacing w:after="0" w:line="252" w:lineRule="auto"/>
+              <w:rPr>
+                <w:sz w:val="20"/>
+                <w:szCs w:val="20"/>
+                <w:b/>
+                <w:color w:val="FFFFFF"/>
+              </w:rPr>
+            </w:pPr>
+            <w:r>
+              <w:rPr>
+                <w:sz w:val="20"/>
+                <w:szCs w:val="20"/>
+                <w:b/>
+                <w:color w:val="FFFFFF"/>
+              </w:rPr>
+              <w:t xml:space="preserve">Comment</w:t>
+            </w:r>
+          </w:p>
+        </w:tc>
+      </w:tr>
+      <w:tr>
+        <w:tc>
+          <w:tcPr>
+            <w:tcW w:w="3400" w:type="dxa"/>
+            <w:shd w:val="clear" w:color="auto" w:fill="F6E84F"/>
+            <w:tcMar>
+              <w:top w:w="40" w:type="dxa"/>
+              <w:left w:w="110" w:type="dxa"/>
+              <w:bottom w:w="40" w:type="dxa"/>
+              <w:right w:w="110" w:type="dxa"/>
+            </w:tcMar>
+            <w:vAlign w:val="center"/>
+          </w:tcPr>
+          <w:p>
+            <w:pPr>
+              <w:spacing w:after="0" w:line="252" w:lineRule="auto"/>
+              <w:rPr>
+                <w:sz w:val="20"/>
+                <w:szCs w:val="20"/>
+                <w:b/>
+                <w:color w:val="000000"/>
+              </w:rPr>
+            </w:pPr>
+            <w:r>
+              <w:rPr>
+                <w:sz w:val="20"/>
+                <w:szCs w:val="20"/>
+                <w:b/>
+                <w:color w:val="000000"/>
+              </w:rPr>
+              <w:t xml:space="preserve">Gas</w:t>
+            </w:r>
+          </w:p>
+        </w:tc>
+        <w:tc>
+          <w:tcPr>
+            <w:tcW w:w="1700" w:type="dxa"/>
+            <w:tcMar>
+              <w:top w:w="40" w:type="dxa"/>
+              <w:left w:w="110" w:type="dxa"/>
+              <w:bottom w:w="40" w:type="dxa"/>
+              <w:right w:w="110" w:type="dxa"/>
+            </w:tcMar>
+            <w:vAlign w:val="center"/>
+          </w:tcPr>
+          <w:p>
+            <w:pPr>
+              <w:spacing w:after="0" w:line="252" w:lineRule="auto"/>
+              <w:jc w:val="center"/>
+              <w:rPr>
+                <w:sz w:val="20"/>
+                <w:szCs w:val="20"/>
+                <w:color w:val="130C0E"/>
+              </w:rPr>
+            </w:pPr>
+            <w:r>
+              <w:rPr>
+                <w:sz w:val="20"/>
+                <w:szCs w:val="20"/>
+                <w:color w:val="130C0E"/>
+              </w:rPr>
+              <w:t xml:space="preserve">{gas_quality}</w:t>
+            </w:r>
+          </w:p>
+        </w:tc>
+        <w:tc>
+          <w:tcPr>
+            <w:tcW w:w="4986" w:type="dxa"/>
+            <w:tcMar>
+              <w:top w:w="40" w:type="dxa"/>
+              <w:left w:w="110" w:type="dxa"/>
+              <w:bottom w:w="40" w:type="dxa"/>
+              <w:right w:w="110" w:type="dxa"/>
+            </w:tcMar>
+            <w:vAlign w:val="center"/>
+          </w:tcPr>
+          <w:p>
+            <w:pPr>
+              <w:spacing w:after="0" w:line="252" w:lineRule="auto"/>
+              <w:rPr>
+                <w:sz w:val="20"/>
+                <w:szCs w:val="20"/>
+                <w:color w:val="130C0E"/>
+              </w:rPr>
+            </w:pPr>
+            <w:r>
+              <w:rPr>
+                <w:sz w:val="20"/>
+                <w:szCs w:val="20"/>
+                <w:color w:val="130C0E"/>
+              </w:rPr>
+              <w:t xml:space="preserve">{gas_comment}</w:t>
+            </w:r>
+          </w:p>
+        </w:tc>
+      </w:tr>
+      <w:tr>
+        <w:tc>
+          <w:tcPr>
+            <w:tcW w:w="3400" w:type="dxa"/>
+            <w:tcMar>
+              <w:top w:w="40" w:type="dxa"/>
+              <w:left w:w="110" w:type="dxa"/>
+              <w:bottom w:w="40" w:type="dxa"/>
+              <w:right w:w="110" w:type="dxa"/>
+            </w:tcMar>
+            <w:vAlign w:val="center"/>
+          </w:tcPr>
+          <w:p>
+            <w:pPr>
+              <w:spacing w:after="0" w:line="252" w:lineRule="auto"/>
+              <w:rPr>
+                <w:sz w:val="20"/>
+                <w:szCs w:val="20"/>
+                <w:b/>
+                <w:color w:val="000000"/>
+              </w:rPr>
+            </w:pPr>
+            <w:r>
+              <w:rPr>
+                <w:sz w:val="20"/>
+                <w:szCs w:val="20"/>
+                <w:b/>
+                <w:color w:val="000000"/>
+              </w:rPr>
+              <w:t xml:space="preserve">Telstra</w:t>
+            </w:r>
+          </w:p>
+        </w:tc>
+        <w:tc>
+          <w:tcPr>
+            <w:tcW w:w="1700" w:type="dxa"/>
+            <w:tcMar>
+              <w:top w:w="40" w:type="dxa"/>
+              <w:left w:w="110" w:type="dxa"/>
+              <w:bottom w:w="40" w:type="dxa"/>
+              <w:right w:w="110" w:type="dxa"/>
+            </w:tcMar>
+            <w:vAlign w:val="center"/>
+          </w:tcPr>
+          <w:p>
+            <w:pPr>
+              <w:spacing w:after="0" w:line="252" w:lineRule="auto"/>
+              <w:jc w:val="center"/>
+              <w:rPr>
+                <w:sz w:val="20"/>
+                <w:szCs w:val="20"/>
+                <w:color w:val="130C0E"/>
+              </w:rPr>
+            </w:pPr>
+            <w:r>
+              <w:rPr>
+                <w:sz w:val="20"/>
+                <w:szCs w:val="20"/>
+                <w:color w:val="130C0E"/>
+              </w:rPr>
+              <w:t xml:space="preserve">{telstra_quality}</w:t>
+            </w:r>
+          </w:p>
+        </w:tc>
+        <w:tc>
+          <w:tcPr>
+            <w:tcW w:w="4986" w:type="dxa"/>
+            <w:tcMar>
+              <w:top w:w="40" w:type="dxa"/>
+              <w:left w:w="110" w:type="dxa"/>
+              <w:bottom w:w="40" w:type="dxa"/>
+              <w:right w:w="110" w:type="dxa"/>
+            </w:tcMar>
+            <w:vAlign w:val="center"/>
+          </w:tcPr>
+          <w:p>
+            <w:pPr>
+              <w:spacing w:after="0" w:line="252" w:lineRule="auto"/>
+              <w:rPr>
+                <w:sz w:val="20"/>
+                <w:szCs w:val="20"/>
+                <w:color w:val="130C0E"/>
+              </w:rPr>
+            </w:pPr>
+            <w:r>
+              <w:rPr>
+                <w:sz w:val="20"/>
+                <w:szCs w:val="20"/>
+                <w:color w:val="130C0E"/>
+              </w:rPr>
+              <w:t xml:space="preserve">{telstra_comment}</w:t>
+            </w:r>
+          </w:p>
+        </w:tc>
+      </w:tr>
+      <w:tr>
+        <w:tc>
+          <w:tcPr>
+            <w:tcW w:w="3400" w:type="dxa"/>
+            <w:shd w:val="clear" w:color="auto" w:fill="F4B183"/>
+            <w:tcMar>
+              <w:top w:w="40" w:type="dxa"/>
+              <w:left w:w="110" w:type="dxa"/>
+              <w:bottom w:w="40" w:type="dxa"/>
+              <w:right w:w="110" w:type="dxa"/>
+            </w:tcMar>
+            <w:vAlign w:val="center"/>
+          </w:tcPr>
+          <w:p>
+            <w:pPr>
+              <w:spacing w:after="0" w:line="252" w:lineRule="auto"/>
+              <w:rPr>
+                <w:sz w:val="20"/>
+                <w:szCs w:val="20"/>
+                <w:b/>
+                <w:color w:val="000000"/>
+              </w:rPr>
+            </w:pPr>
+            <w:r>
+              <w:rPr>
+                <w:sz w:val="20"/>
+                <w:szCs w:val="20"/>
+                <w:b/>
+                <w:color w:val="000000"/>
+              </w:rPr>
+              <w:t xml:space="preserve">Electricity (LV and HV)</w:t>
+            </w:r>
+          </w:p>
+        </w:tc>
+        <w:tc>
+          <w:tcPr>
+            <w:tcW w:w="1700" w:type="dxa"/>
+            <w:tcMar>
+              <w:top w:w="40" w:type="dxa"/>
+              <w:left w:w="110" w:type="dxa"/>
+              <w:bottom w:w="40" w:type="dxa"/>
+              <w:right w:w="110" w:type="dxa"/>
+            </w:tcMar>
+            <w:vAlign w:val="center"/>
+          </w:tcPr>
+          <w:p>
+            <w:pPr>
+              <w:spacing w:after="0" w:line="252" w:lineRule="auto"/>
+              <w:jc w:val="center"/>
+              <w:rPr>
+                <w:sz w:val="20"/>
+                <w:szCs w:val="20"/>
+                <w:color w:val="130C0E"/>
+              </w:rPr>
+            </w:pPr>
+            <w:r>
+              <w:rPr>
+                <w:sz w:val="20"/>
+                <w:szCs w:val="20"/>
+                <w:color w:val="130C0E"/>
+              </w:rPr>
+              <w:t xml:space="preserve">{electricity_quality}</w:t>
+            </w:r>
+          </w:p>
+        </w:tc>
+        <w:tc>
+          <w:tcPr>
+            <w:tcW w:w="4986" w:type="dxa"/>
+            <w:tcMar>
+              <w:top w:w="40" w:type="dxa"/>
+              <w:left w:w="110" w:type="dxa"/>
+              <w:bottom w:w="40" w:type="dxa"/>
+              <w:right w:w="110" w:type="dxa"/>
+            </w:tcMar>
+            <w:vAlign w:val="center"/>
+          </w:tcPr>
+          <w:p>
+            <w:pPr>
+              <w:spacing w:after="0" w:line="252" w:lineRule="auto"/>
+              <w:rPr>
+                <w:sz w:val="20"/>
+                <w:szCs w:val="20"/>
+                <w:color w:val="130C0E"/>
+              </w:rPr>
+            </w:pPr>
+            <w:r>
+              <w:rPr>
+                <w:sz w:val="20"/>
+                <w:szCs w:val="20"/>
+                <w:color w:val="130C0E"/>
+              </w:rPr>
+              <w:t xml:space="preserve">{electricity_comment}</w:t>
+            </w:r>
+          </w:p>
+        </w:tc>
+      </w:tr>
+      <w:tr>
+        <w:tc>
+          <w:tcPr>
+            <w:tcW w:w="3400" w:type="dxa"/>
+            <w:tcMar>
+              <w:top w:w="40" w:type="dxa"/>
+              <w:left w:w="110" w:type="dxa"/>
+              <w:bottom w:w="40" w:type="dxa"/>
+              <w:right w:w="110" w:type="dxa"/>
+            </w:tcMar>
+            <w:vAlign w:val="center"/>
+          </w:tcPr>
+          <w:p>
+            <w:pPr>
+              <w:spacing w:after="0" w:line="252" w:lineRule="auto"/>
+              <w:rPr>
+                <w:sz w:val="20"/>
+                <w:szCs w:val="20"/>
+                <w:b/>
+                <w:color w:val="000000"/>
+              </w:rPr>
+            </w:pPr>
+            <w:r>
+              <w:rPr>
+                <w:sz w:val="20"/>
+                <w:szCs w:val="20"/>
+                <w:b/>
+                <w:color w:val="000000"/>
+              </w:rPr>
+              <w:t xml:space="preserve">Communications / Fibre Optic</w:t>
+            </w:r>
+          </w:p>
+        </w:tc>
+        <w:tc>
+          <w:tcPr>
+            <w:tcW w:w="1700" w:type="dxa"/>
+            <w:tcMar>
+              <w:top w:w="40" w:type="dxa"/>
+              <w:left w:w="110" w:type="dxa"/>
+              <w:bottom w:w="40" w:type="dxa"/>
+              <w:right w:w="110" w:type="dxa"/>
+            </w:tcMar>
+            <w:vAlign w:val="center"/>
+          </w:tcPr>
+          <w:p>
+            <w:pPr>
+              <w:spacing w:after="0" w:line="252" w:lineRule="auto"/>
+              <w:jc w:val="center"/>
+              <w:rPr>
+                <w:sz w:val="20"/>
+                <w:szCs w:val="20"/>
+                <w:color w:val="130C0E"/>
+              </w:rPr>
+            </w:pPr>
+            <w:r>
+              <w:rPr>
+                <w:sz w:val="20"/>
+                <w:szCs w:val="20"/>
+                <w:color w:val="130C0E"/>
+              </w:rPr>
+              <w:t xml:space="preserve">{comms_quality}</w:t>
+            </w:r>
+          </w:p>
+        </w:tc>
+        <w:tc>
+          <w:tcPr>
+            <w:tcW w:w="4986" w:type="dxa"/>
+            <w:tcMar>
+              <w:top w:w="40" w:type="dxa"/>
+              <w:left w:w="110" w:type="dxa"/>
+              <w:bottom w:w="40" w:type="dxa"/>
+              <w:right w:w="110" w:type="dxa"/>
+            </w:tcMar>
+            <w:vAlign w:val="center"/>
+          </w:tcPr>
+          <w:p>
+            <w:pPr>
+              <w:spacing w:after="0" w:line="252" w:lineRule="auto"/>
+              <w:rPr>
+                <w:sz w:val="20"/>
+                <w:szCs w:val="20"/>
+                <w:color w:val="130C0E"/>
+              </w:rPr>
+            </w:pPr>
+            <w:r>
+              <w:rPr>
+                <w:sz w:val="20"/>
+                <w:szCs w:val="20"/>
+                <w:color w:val="130C0E"/>
+              </w:rPr>
+              <w:t xml:space="preserve">{comms_comment}</w:t>
+            </w:r>
+          </w:p>
+        </w:tc>
+      </w:tr>
+      <w:tr>
+        <w:tc>
+          <w:tcPr>
+            <w:tcW w:w="3400" w:type="dxa"/>
+            <w:shd w:val="clear" w:color="auto" w:fill="8EAADB"/>
+            <w:tcMar>
+              <w:top w:w="40" w:type="dxa"/>
+              <w:left w:w="110" w:type="dxa"/>
+              <w:bottom w:w="40" w:type="dxa"/>
+              <w:right w:w="110" w:type="dxa"/>
+            </w:tcMar>
+            <w:vAlign w:val="center"/>
+          </w:tcPr>
+          <w:p>
+            <w:pPr>
+              <w:spacing w:after="0" w:line="252" w:lineRule="auto"/>
+              <w:rPr>
+                <w:sz w:val="20"/>
+                <w:szCs w:val="20"/>
+                <w:b/>
+                <w:color w:val="000000"/>
+              </w:rPr>
+            </w:pPr>
+            <w:r>
+              <w:rPr>
+                <w:sz w:val="20"/>
+                <w:szCs w:val="20"/>
+                <w:b/>
+                <w:color w:val="000000"/>
+              </w:rPr>
+              <w:t xml:space="preserve">Water</w:t>
+            </w:r>
+          </w:p>
+        </w:tc>
+        <w:tc>
+          <w:tcPr>
+            <w:tcW w:w="1700" w:type="dxa"/>
+            <w:tcMar>
+              <w:top w:w="40" w:type="dxa"/>
+              <w:left w:w="110" w:type="dxa"/>
+              <w:bottom w:w="40" w:type="dxa"/>
+              <w:right w:w="110" w:type="dxa"/>
+            </w:tcMar>
+            <w:vAlign w:val="center"/>
+          </w:tcPr>
+          <w:p>
+            <w:pPr>
+              <w:spacing w:after="0" w:line="252" w:lineRule="auto"/>
+              <w:jc w:val="center"/>
+              <w:rPr>
+                <w:sz w:val="20"/>
+                <w:szCs w:val="20"/>
+                <w:color w:val="130C0E"/>
+              </w:rPr>
+            </w:pPr>
+            <w:r>
+              <w:rPr>
+                <w:sz w:val="20"/>
+                <w:szCs w:val="20"/>
+                <w:color w:val="130C0E"/>
+              </w:rPr>
+              <w:t xml:space="preserve">{water_quality}</w:t>
+            </w:r>
+          </w:p>
+        </w:tc>
+        <w:tc>
+          <w:tcPr>
+            <w:tcW w:w="4986" w:type="dxa"/>
+            <w:tcMar>
+              <w:top w:w="40" w:type="dxa"/>
+              <w:left w:w="110" w:type="dxa"/>
+              <w:bottom w:w="40" w:type="dxa"/>
+              <w:right w:w="110" w:type="dxa"/>
+            </w:tcMar>
+            <w:vAlign w:val="center"/>
+          </w:tcPr>
+          <w:p>
+            <w:pPr>
+              <w:spacing w:after="0" w:line="252" w:lineRule="auto"/>
+              <w:rPr>
+                <w:sz w:val="20"/>
+                <w:szCs w:val="20"/>
+                <w:color w:val="130C0E"/>
+              </w:rPr>
+            </w:pPr>
+            <w:r>
+              <w:rPr>
+                <w:sz w:val="20"/>
+                <w:szCs w:val="20"/>
+                <w:color w:val="130C0E"/>
+              </w:rPr>
+              <w:t xml:space="preserve">{water_comment}</w:t>
+            </w:r>
+          </w:p>
+        </w:tc>
+      </w:tr>
+      <w:tr>
+        <w:tc>
+          <w:tcPr>
+            <w:tcW w:w="3400" w:type="dxa"/>
+            <w:shd w:val="clear" w:color="auto" w:fill="FBE4D5"/>
+            <w:tcMar>
+              <w:top w:w="40" w:type="dxa"/>
+              <w:left w:w="110" w:type="dxa"/>
+              <w:bottom w:w="40" w:type="dxa"/>
+              <w:right w:w="110" w:type="dxa"/>
+            </w:tcMar>
+            <w:vAlign w:val="center"/>
+          </w:tcPr>
+          <w:p>
+            <w:pPr>
+              <w:spacing w:after="0" w:line="252" w:lineRule="auto"/>
+              <w:rPr>
+                <w:sz w:val="20"/>
+                <w:szCs w:val="20"/>
+                <w:b/>
+                <w:color w:val="000000"/>
+              </w:rPr>
+            </w:pPr>
+            <w:r>
+              <w:rPr>
+                <w:sz w:val="20"/>
+                <w:szCs w:val="20"/>
+                <w:b/>
+                <w:color w:val="000000"/>
+              </w:rPr>
+              <w:t xml:space="preserve">Sewer</w:t>
+            </w:r>
+          </w:p>
+        </w:tc>
+        <w:tc>
+          <w:tcPr>
+            <w:tcW w:w="1700" w:type="dxa"/>
+            <w:tcMar>
+              <w:top w:w="40" w:type="dxa"/>
+              <w:left w:w="110" w:type="dxa"/>
+              <w:bottom w:w="40" w:type="dxa"/>
+              <w:right w:w="110" w:type="dxa"/>
+            </w:tcMar>
+            <w:vAlign w:val="center"/>
+          </w:tcPr>
+          <w:p>
+            <w:pPr>
+              <w:spacing w:after="0" w:line="252" w:lineRule="auto"/>
+              <w:jc w:val="center"/>
+              <w:rPr>
+                <w:sz w:val="20"/>
+                <w:szCs w:val="20"/>
+                <w:color w:val="130C0E"/>
+              </w:rPr>
+            </w:pPr>
+            <w:r>
+              <w:rPr>
+                <w:sz w:val="20"/>
+                <w:szCs w:val="20"/>
+                <w:color w:val="130C0E"/>
+              </w:rPr>
+              <w:t xml:space="preserve">{sewer_quality}</w:t>
+            </w:r>
+          </w:p>
+        </w:tc>
+        <w:tc>
+          <w:tcPr>
+            <w:tcW w:w="4986" w:type="dxa"/>
+            <w:tcMar>
+              <w:top w:w="40" w:type="dxa"/>
+              <w:left w:w="110" w:type="dxa"/>
+              <w:bottom w:w="40" w:type="dxa"/>
+              <w:right w:w="110" w:type="dxa"/>
+            </w:tcMar>
+            <w:vAlign w:val="center"/>
+          </w:tcPr>
+          <w:p>
+            <w:pPr>
+              <w:spacing w:after="0" w:line="252" w:lineRule="auto"/>
+              <w:rPr>
+                <w:sz w:val="20"/>
+                <w:szCs w:val="20"/>
+                <w:color w:val="130C0E"/>
+              </w:rPr>
+            </w:pPr>
+            <w:r>
+              <w:rPr>
+                <w:sz w:val="20"/>
+                <w:szCs w:val="20"/>
+                <w:color w:val="130C0E"/>
+              </w:rPr>
+              <w:t xml:space="preserve">{sewer_comment}</w:t>
+            </w:r>
+          </w:p>
+        </w:tc>
+      </w:tr>
+      <w:tr>
+        <w:tc>
+          <w:tcPr>
+            <w:tcW w:w="3400" w:type="dxa"/>
+            <w:shd w:val="clear" w:color="auto" w:fill="92D050"/>
+            <w:tcMar>
+              <w:top w:w="40" w:type="dxa"/>
+              <w:left w:w="110" w:type="dxa"/>
+              <w:bottom w:w="40" w:type="dxa"/>
+              <w:right w:w="110" w:type="dxa"/>
+            </w:tcMar>
+            <w:vAlign w:val="center"/>
+          </w:tcPr>
+          <w:p>
+            <w:pPr>
+              <w:spacing w:after="0" w:line="252" w:lineRule="auto"/>
+              <w:rPr>
+                <w:sz w:val="20"/>
+                <w:szCs w:val="20"/>
+                <w:b/>
+                <w:color w:val="000000"/>
+              </w:rPr>
+            </w:pPr>
+            <w:r>
+              <w:rPr>
+                <w:sz w:val="20"/>
+                <w:szCs w:val="20"/>
+                <w:b/>
+                <w:color w:val="000000"/>
+              </w:rPr>
+              <w:t xml:space="preserve">Stormwater</w:t>
+            </w:r>
+          </w:p>
+        </w:tc>
+        <w:tc>
+          <w:tcPr>
+            <w:tcW w:w="1700" w:type="dxa"/>
+            <w:tcMar>
+              <w:top w:w="40" w:type="dxa"/>
+              <w:left w:w="110" w:type="dxa"/>
+              <w:bottom w:w="40" w:type="dxa"/>
+              <w:right w:w="110" w:type="dxa"/>
+            </w:tcMar>
+            <w:vAlign w:val="center"/>
+          </w:tcPr>
+          <w:p>
+            <w:pPr>
+              <w:spacing w:after="0" w:line="252" w:lineRule="auto"/>
+              <w:jc w:val="center"/>
+              <w:rPr>
+                <w:sz w:val="20"/>
+                <w:szCs w:val="20"/>
+                <w:color w:val="130C0E"/>
+              </w:rPr>
+            </w:pPr>
+            <w:r>
+              <w:rPr>
+                <w:sz w:val="20"/>
+                <w:szCs w:val="20"/>
+                <w:color w:val="130C0E"/>
+              </w:rPr>
+              <w:t xml:space="preserve">{stormwater_quality}</w:t>
+            </w:r>
+          </w:p>
+        </w:tc>
+        <w:tc>
+          <w:tcPr>
+            <w:tcW w:w="4986" w:type="dxa"/>
+            <w:tcMar>
+              <w:top w:w="40" w:type="dxa"/>
+              <w:left w:w="110" w:type="dxa"/>
+              <w:bottom w:w="40" w:type="dxa"/>
+              <w:right w:w="110" w:type="dxa"/>
+            </w:tcMar>
+            <w:vAlign w:val="center"/>
+          </w:tcPr>
+          <w:p>
+            <w:pPr>
+              <w:spacing w:after="0" w:line="252" w:lineRule="auto"/>
+              <w:rPr>
+                <w:sz w:val="20"/>
+                <w:szCs w:val="20"/>
+                <w:color w:val="130C0E"/>
+              </w:rPr>
+            </w:pPr>
+            <w:r>
+              <w:rPr>
+                <w:sz w:val="20"/>
+                <w:szCs w:val="20"/>
+                <w:color w:val="130C0E"/>
+              </w:rPr>
+              <w:t xml:space="preserve">{stormwater_comment}</w:t>
+            </w:r>
+          </w:p>
+        </w:tc>
+      </w:tr>
+      <w:tr>
+        <w:tc>
+          <w:tcPr>
+            <w:tcW w:w="3400" w:type="dxa"/>
+            <w:shd w:val="clear" w:color="auto" w:fill="D777C5"/>
+            <w:tcMar>
+              <w:top w:w="40" w:type="dxa"/>
+              <w:left w:w="110" w:type="dxa"/>
+              <w:bottom w:w="40" w:type="dxa"/>
+              <w:right w:w="110" w:type="dxa"/>
+            </w:tcMar>
+            <w:vAlign w:val="center"/>
+          </w:tcPr>
+          <w:p>
+            <w:pPr>
+              <w:spacing w:after="0" w:line="252" w:lineRule="auto"/>
+              <w:rPr>
+                <w:sz w:val="20"/>
+                <w:szCs w:val="20"/>
+                <w:b/>
+                <w:color w:val="000000"/>
+              </w:rPr>
+            </w:pPr>
+            <w:r>
+              <w:rPr>
+                <w:sz w:val="20"/>
+                <w:szCs w:val="20"/>
+                <w:b/>
+                <w:color w:val="000000"/>
+              </w:rPr>
+              <w:t xml:space="preserve">Recycled Water</w:t>
+            </w:r>
+          </w:p>
+        </w:tc>
+        <w:tc>
+          <w:tcPr>
+            <w:tcW w:w="1700" w:type="dxa"/>
+            <w:tcMar>
+              <w:top w:w="40" w:type="dxa"/>
+              <w:left w:w="110" w:type="dxa"/>
+              <w:bottom w:w="40" w:type="dxa"/>
+              <w:right w:w="110" w:type="dxa"/>
+            </w:tcMar>
+            <w:vAlign w:val="center"/>
+          </w:tcPr>
+          <w:p>
+            <w:pPr>
+              <w:spacing w:after="0" w:line="252" w:lineRule="auto"/>
+              <w:jc w:val="center"/>
+              <w:rPr>
+                <w:sz w:val="20"/>
+                <w:szCs w:val="20"/>
+                <w:color w:val="130C0E"/>
+              </w:rPr>
+            </w:pPr>
+            <w:r>
+              <w:rPr>
+                <w:sz w:val="20"/>
+                <w:szCs w:val="20"/>
+                <w:color w:val="130C0E"/>
+              </w:rPr>
+              <w:t xml:space="preserve">{recycled_quality}</w:t>
+            </w:r>
+          </w:p>
+        </w:tc>
+        <w:tc>
+          <w:tcPr>
+            <w:tcW w:w="4986" w:type="dxa"/>
+            <w:tcMar>
+              <w:top w:w="40" w:type="dxa"/>
+              <w:left w:w="110" w:type="dxa"/>
+              <w:bottom w:w="40" w:type="dxa"/>
+              <w:right w:w="110" w:type="dxa"/>
+            </w:tcMar>
+            <w:vAlign w:val="center"/>
+          </w:tcPr>
+          <w:p>
+            <w:pPr>
+              <w:spacing w:after="0" w:line="252" w:lineRule="auto"/>
+              <w:rPr>
+                <w:sz w:val="20"/>
+                <w:szCs w:val="20"/>
+                <w:color w:val="130C0E"/>
+              </w:rPr>
+            </w:pPr>
+            <w:r>
+              <w:rPr>
+                <w:sz w:val="20"/>
+                <w:szCs w:val="20"/>
+                <w:color w:val="130C0E"/>
+              </w:rPr>
+              <w:t xml:space="preserve">{recycled_comment}</w:t>
+            </w:r>
+          </w:p>
+        </w:tc>
+      </w:tr>
+      <w:tr>
+        <w:tc>
+          <w:tcPr>
+            <w:tcW w:w="3400" w:type="dxa"/>
+            <w:shd w:val="clear" w:color="auto" w:fill="FF3399"/>
+            <w:tcMar>
+              <w:top w:w="40" w:type="dxa"/>
+              <w:left w:w="110" w:type="dxa"/>
+              <w:bottom w:w="40" w:type="dxa"/>
+              <w:right w:w="110" w:type="dxa"/>
+            </w:tcMar>
+            <w:vAlign w:val="center"/>
+          </w:tcPr>
+          <w:p>
+            <w:pPr>
+              <w:spacing w:after="0" w:line="252" w:lineRule="auto"/>
+              <w:rPr>
+                <w:sz w:val="20"/>
+                <w:szCs w:val="20"/>
+                <w:b/>
+                <w:color w:val="000000"/>
+              </w:rPr>
+            </w:pPr>
+            <w:r>
+              <w:rPr>
+                <w:sz w:val="20"/>
+                <w:szCs w:val="20"/>
+                <w:b/>
+                <w:color w:val="000000"/>
+              </w:rPr>
+              <w:t xml:space="preserve">Unknown Service</w:t>
+            </w:r>
+          </w:p>
+        </w:tc>
+        <w:tc>
+          <w:tcPr>
+            <w:tcW w:w="1700" w:type="dxa"/>
+            <w:tcMar>
+              <w:top w:w="40" w:type="dxa"/>
+              <w:left w:w="110" w:type="dxa"/>
+              <w:bottom w:w="40" w:type="dxa"/>
+              <w:right w:w="110" w:type="dxa"/>
+            </w:tcMar>
+            <w:vAlign w:val="center"/>
+          </w:tcPr>
+          <w:p>
+            <w:pPr>
+              <w:spacing w:after="0" w:line="252" w:lineRule="auto"/>
+              <w:jc w:val="center"/>
+              <w:rPr>
+                <w:sz w:val="20"/>
+                <w:szCs w:val="20"/>
+                <w:color w:val="130C0E"/>
+              </w:rPr>
+            </w:pPr>
+            <w:r>
+              <w:rPr>
+                <w:sz w:val="20"/>
+                <w:szCs w:val="20"/>
+                <w:color w:val="130C0E"/>
+              </w:rPr>
+              <w:t xml:space="preserve">{unknown_quality}</w:t>
+            </w:r>
+          </w:p>
+        </w:tc>
+        <w:tc>
+          <w:tcPr>
+            <w:tcW w:w="4986" w:type="dxa"/>
+            <w:tcMar>
+              <w:top w:w="40" w:type="dxa"/>
+              <w:left w:w="110" w:type="dxa"/>
+              <w:bottom w:w="40" w:type="dxa"/>
+              <w:right w:w="110" w:type="dxa"/>
+            </w:tcMar>
+            <w:vAlign w:val="center"/>
+          </w:tcPr>
+          <w:p>
+            <w:pPr>
+              <w:spacing w:after="0" w:line="252" w:lineRule="auto"/>
+              <w:rPr>
+                <w:sz w:val="20"/>
+                <w:szCs w:val="20"/>
+                <w:color w:val="130C0E"/>
+              </w:rPr>
+            </w:pPr>
+            <w:r>
+              <w:rPr>
+                <w:sz w:val="20"/>
+                <w:szCs w:val="20"/>
+                <w:color w:val="130C0E"/>
+              </w:rPr>
+              <w:t xml:space="preserve">{unknown_comment}</w:t>
+            </w:r>
+          </w:p>
+        </w:tc>
+      </w:tr>
+      <w:tr>
+        <w:tc>
+          <w:tcPr>
+            <w:tcW w:w="3400" w:type="dxa"/>
+            <w:shd w:val="clear" w:color="auto" w:fill="FFFF00"/>
+            <w:tcMar>
+              <w:top w:w="40" w:type="dxa"/>
+              <w:left w:w="110" w:type="dxa"/>
+              <w:bottom w:w="40" w:type="dxa"/>
+              <w:right w:w="110" w:type="dxa"/>
+            </w:tcMar>
+            <w:vAlign w:val="center"/>
+          </w:tcPr>
+          <w:p>
+            <w:pPr>
+              <w:spacing w:after="0" w:line="252" w:lineRule="auto"/>
+              <w:rPr>
+                <w:sz w:val="20"/>
+                <w:szCs w:val="20"/>
+                <w:b/>
+                <w:color w:val="000000"/>
+              </w:rPr>
+            </w:pPr>
+            <w:r>
+              <w:rPr>
+                <w:sz w:val="20"/>
+                <w:szCs w:val="20"/>
+                <w:b/>
+                <w:color w:val="000000"/>
+              </w:rPr>
+              <w:t xml:space="preserve">Earth Grid (Substation)</w:t>
+            </w:r>
+          </w:p>
+        </w:tc>
+        <w:tc>
+          <w:tcPr>
+            <w:tcW w:w="1700" w:type="dxa"/>
+            <w:tcMar>
+              <w:top w:w="40" w:type="dxa"/>
+              <w:left w:w="110" w:type="dxa"/>
+              <w:bottom w:w="40" w:type="dxa"/>
+              <w:right w:w="110" w:type="dxa"/>
+            </w:tcMar>
+            <w:vAlign w:val="center"/>
+          </w:tcPr>
+          <w:p>
+            <w:pPr>
+              <w:spacing w:after="0" w:line="252" w:lineRule="auto"/>
+              <w:jc w:val="center"/>
+              <w:rPr>
+                <w:sz w:val="20"/>
+                <w:szCs w:val="20"/>
+                <w:color w:val="130C0E"/>
+              </w:rPr>
+            </w:pPr>
+            <w:r>
+              <w:rPr>
+                <w:sz w:val="20"/>
+                <w:szCs w:val="20"/>
+                <w:color w:val="130C0E"/>
+              </w:rPr>
+              <w:t xml:space="preserve">{earth_quality}</w:t>
+            </w:r>
+          </w:p>
+        </w:tc>
+        <w:tc>
+          <w:tcPr>
+            <w:tcW w:w="4986" w:type="dxa"/>
+            <w:tcMar>
+              <w:top w:w="40" w:type="dxa"/>
+              <w:left w:w="110" w:type="dxa"/>
+              <w:bottom w:w="40" w:type="dxa"/>
+              <w:right w:w="110" w:type="dxa"/>
+            </w:tcMar>
+            <w:vAlign w:val="center"/>
+          </w:tcPr>
+          <w:p>
+            <w:pPr>
+              <w:spacing w:after="0" w:line="252" w:lineRule="auto"/>
+              <w:rPr>
+                <w:sz w:val="20"/>
+                <w:szCs w:val="20"/>
+                <w:color w:val="130C0E"/>
+              </w:rPr>
+            </w:pPr>
+            <w:r>
+              <w:rPr>
+                <w:sz w:val="20"/>
+                <w:szCs w:val="20"/>
+                <w:color w:val="130C0E"/>
+              </w:rPr>
+              <w:t xml:space="preserve">{earth_comment}</w:t>
+            </w:r>
+          </w:p>
+        </w:tc>
+      </w:tr>
+    </w:tbl>
     <w:p>
       <w:pPr>
         <w:pBdr>

</xml_diff>

<commit_message>
fix(sign-off): capture signature reliably + requested layout
Signature wasn't being added:
- "Add my signature" now awaits the profile/signature fetch if it hasn't
  arrived yet, so an immediate click still loads the saved signature.
- getValue() auto-captures a drawn signature even if the user didn't press
  "Use drawing".
- Date is formatted dd/mm/yyyy for the report.

Layout (both templates) now matches the requested format:
  UTILITY LOCATOR : <name>            DATE : <date>
  SIGNATURE : <signature image>
(tab-aligned locator/date on one line, signature inline below). Signature
image enlarged to ~230x85. Rebuilt + rendered both templates to verify.
</commit_message>
<xml_diff>
--- a/public/templates/photo-report.docx
+++ b/public/templates/photo-report.docx
@@ -3951,216 +3951,74 @@
         <w:t xml:space="preserve">Sign-off</w:t>
       </w:r>
     </w:p>
-    <w:tbl>
-      <w:tblPr>
-        <w:tblW w:w="10086" w:type="dxa"/>
-        <w:jc w:val="left"/>
-        <w:tblInd w:w="0" w:type="dxa"/>
-        <w:tblBorders>
-          <w:top w:val="single" w:sz="4" w:space="0" w:color="E6E3DD"/>
-          <w:left w:val="single" w:sz="4" w:space="0" w:color="E6E3DD"/>
-          <w:bottom w:val="single" w:sz="4" w:space="0" w:color="E6E3DD"/>
-          <w:right w:val="single" w:sz="4" w:space="0" w:color="E6E3DD"/>
-          <w:insideH w:val="single" w:sz="4" w:space="0" w:color="E6E3DD"/>
-          <w:insideV w:val="single" w:sz="4" w:space="0" w:color="E6E3DD"/>
-        </w:tblBorders>
-      </w:tblPr>
-      <w:tblGrid>
-        <w:gridCol w:w="2900"/>
-        <w:gridCol w:w="7186"/>
-      </w:tblGrid>
-      <w:tr>
-        <w:tc>
-          <w:tcPr>
-            <w:tcW w:w="2900" w:type="dxa"/>
-            <w:shd w:val="clear" w:color="auto" w:fill="FBF6E9"/>
-            <w:tcMar>
-              <w:top w:w="40" w:type="dxa"/>
-              <w:left w:w="110" w:type="dxa"/>
-              <w:bottom w:w="40" w:type="dxa"/>
-              <w:right w:w="110" w:type="dxa"/>
-            </w:tcMar>
-            <w:vAlign w:val="center"/>
-          </w:tcPr>
-          <w:p>
-            <w:pPr>
-              <w:spacing w:after="0" w:line="252" w:lineRule="auto"/>
-              <w:rPr>
-                <w:sz w:val="22"/>
-                <w:szCs w:val="22"/>
-                <w:b/>
-                <w:color w:val="130C0E"/>
-              </w:rPr>
-            </w:pPr>
-            <w:r>
-              <w:rPr>
-                <w:sz w:val="22"/>
-                <w:szCs w:val="22"/>
-                <w:b/>
-                <w:color w:val="130C0E"/>
-              </w:rPr>
-              <w:t xml:space="preserve">UTILITY LOCATOR</w:t>
-            </w:r>
-          </w:p>
-        </w:tc>
-        <w:tc>
-          <w:tcPr>
-            <w:tcW w:w="7186" w:type="dxa"/>
-            <w:tcMar>
-              <w:top w:w="40" w:type="dxa"/>
-              <w:left w:w="110" w:type="dxa"/>
-              <w:bottom w:w="40" w:type="dxa"/>
-              <w:right w:w="110" w:type="dxa"/>
-            </w:tcMar>
-            <w:vAlign w:val="center"/>
-          </w:tcPr>
-          <w:p>
-            <w:pPr>
-              <w:spacing w:after="0" w:line="252" w:lineRule="auto"/>
-              <w:rPr>
-                <w:sz w:val="22"/>
-                <w:szCs w:val="22"/>
-                <w:color w:val="130C0E"/>
-              </w:rPr>
-            </w:pPr>
-            <w:r>
-              <w:rPr>
-                <w:sz w:val="22"/>
-                <w:szCs w:val="22"/>
-                <w:color w:val="130C0E"/>
-              </w:rPr>
-              <w:t xml:space="preserve">{signLocator}</w:t>
-            </w:r>
-          </w:p>
-        </w:tc>
-      </w:tr>
-      <w:tr>
-        <w:tc>
-          <w:tcPr>
-            <w:tcW w:w="2900" w:type="dxa"/>
-            <w:shd w:val="clear" w:color="auto" w:fill="FBF6E9"/>
-            <w:tcMar>
-              <w:top w:w="40" w:type="dxa"/>
-              <w:left w:w="110" w:type="dxa"/>
-              <w:bottom w:w="40" w:type="dxa"/>
-              <w:right w:w="110" w:type="dxa"/>
-            </w:tcMar>
-            <w:vAlign w:val="center"/>
-          </w:tcPr>
-          <w:p>
-            <w:pPr>
-              <w:spacing w:after="0" w:line="252" w:lineRule="auto"/>
-              <w:rPr>
-                <w:sz w:val="22"/>
-                <w:szCs w:val="22"/>
-                <w:b/>
-                <w:color w:val="130C0E"/>
-              </w:rPr>
-            </w:pPr>
-            <w:r>
-              <w:rPr>
-                <w:sz w:val="22"/>
-                <w:szCs w:val="22"/>
-                <w:b/>
-                <w:color w:val="130C0E"/>
-              </w:rPr>
-              <w:t xml:space="preserve">SIGNATURE</w:t>
-            </w:r>
-          </w:p>
-        </w:tc>
-        <w:tc>
-          <w:tcPr>
-            <w:tcW w:w="7186" w:type="dxa"/>
-            <w:tcMar>
-              <w:top w:w="40" w:type="dxa"/>
-              <w:left w:w="110" w:type="dxa"/>
-              <w:bottom w:w="40" w:type="dxa"/>
-              <w:right w:w="110" w:type="dxa"/>
-            </w:tcMar>
-            <w:vAlign w:val="center"/>
-          </w:tcPr>
-          <w:p>
-            <w:pPr>
-              <w:spacing w:before="40" w:after="40"/>
-            </w:pPr>
-            <w:r>
-              <w:t>{#hasSign}</w:t>
-            </w:r>
-            <w:r>
-              <w:t xml:space="preserve">{%signImage}</w:t>
-            </w:r>
-            <w:r>
-              <w:t>{/hasSign}</w:t>
-            </w:r>
-          </w:p>
-        </w:tc>
-      </w:tr>
-      <w:tr>
-        <w:tc>
-          <w:tcPr>
-            <w:tcW w:w="2900" w:type="dxa"/>
-            <w:shd w:val="clear" w:color="auto" w:fill="FBF6E9"/>
-            <w:tcMar>
-              <w:top w:w="40" w:type="dxa"/>
-              <w:left w:w="110" w:type="dxa"/>
-              <w:bottom w:w="40" w:type="dxa"/>
-              <w:right w:w="110" w:type="dxa"/>
-            </w:tcMar>
-            <w:vAlign w:val="center"/>
-          </w:tcPr>
-          <w:p>
-            <w:pPr>
-              <w:spacing w:after="0" w:line="252" w:lineRule="auto"/>
-              <w:rPr>
-                <w:sz w:val="22"/>
-                <w:szCs w:val="22"/>
-                <w:b/>
-                <w:color w:val="130C0E"/>
-              </w:rPr>
-            </w:pPr>
-            <w:r>
-              <w:rPr>
-                <w:sz w:val="22"/>
-                <w:szCs w:val="22"/>
-                <w:b/>
-                <w:color w:val="130C0E"/>
-              </w:rPr>
-              <w:t xml:space="preserve">DATE</w:t>
-            </w:r>
-          </w:p>
-        </w:tc>
-        <w:tc>
-          <w:tcPr>
-            <w:tcW w:w="7186" w:type="dxa"/>
-            <w:tcMar>
-              <w:top w:w="40" w:type="dxa"/>
-              <w:left w:w="110" w:type="dxa"/>
-              <w:bottom w:w="40" w:type="dxa"/>
-              <w:right w:w="110" w:type="dxa"/>
-            </w:tcMar>
-            <w:vAlign w:val="center"/>
-          </w:tcPr>
-          <w:p>
-            <w:pPr>
-              <w:spacing w:after="0" w:line="252" w:lineRule="auto"/>
-              <w:rPr>
-                <w:sz w:val="22"/>
-                <w:szCs w:val="22"/>
-                <w:color w:val="130C0E"/>
-              </w:rPr>
-            </w:pPr>
-            <w:r>
-              <w:rPr>
-                <w:sz w:val="22"/>
-                <w:szCs w:val="22"/>
-                <w:color w:val="130C0E"/>
-              </w:rPr>
-              <w:t xml:space="preserve">{signDate}</w:t>
-            </w:r>
-          </w:p>
-        </w:tc>
-      </w:tr>
-    </w:tbl>
+    <w:p>
+      <w:pPr>
+        <w:tabs>
+          <w:tab w:val="left" w:pos="6400"/>
+        </w:tabs>
+        <w:spacing w:before="120" w:after="360"/>
+      </w:pPr>
+      <w:r>
+        <w:rPr>
+          <w:sz w:val="24"/>
+          <w:szCs w:val="24"/>
+          <w:b/>
+          <w:color w:val="130C0E"/>
+        </w:rPr>
+        <w:t xml:space="preserve">UTILITY LOCATOR : </w:t>
+      </w:r>
+      <w:r>
+        <w:rPr>
+          <w:sz w:val="24"/>
+          <w:szCs w:val="24"/>
+          <w:color w:val="130C0E"/>
+        </w:rPr>
+        <w:t xml:space="preserve">{signLocator}</w:t>
+      </w:r>
+      <w:r>
+        <w:tab/>
+      </w:r>
+      <w:r>
+        <w:rPr>
+          <w:sz w:val="24"/>
+          <w:szCs w:val="24"/>
+          <w:b/>
+          <w:color w:val="130C0E"/>
+        </w:rPr>
+        <w:t xml:space="preserve">DATE : </w:t>
+      </w:r>
+      <w:r>
+        <w:rPr>
+          <w:sz w:val="24"/>
+          <w:szCs w:val="24"/>
+          <w:color w:val="130C0E"/>
+        </w:rPr>
+        <w:t xml:space="preserve">{signDate}</w:t>
+      </w:r>
+    </w:p>
+    <w:p>
+      <w:pPr>
+        <w:spacing w:before="160" w:after="0"/>
+      </w:pPr>
+      <w:r>
+        <w:rPr>
+          <w:sz w:val="24"/>
+          <w:szCs w:val="24"/>
+          <w:b/>
+          <w:color w:val="130C0E"/>
+        </w:rPr>
+        <w:t xml:space="preserve">SIGNATURE : </w:t>
+      </w:r>
+      <w:r>
+        <w:t>{#hasSign}</w:t>
+      </w:r>
+      <w:r>
+        <w:t xml:space="preserve">{%signImage}</w:t>
+      </w:r>
+      <w:r>
+        <w:t>{/hasSign}</w:t>
+      </w:r>
+    </w:p>
     <w:sectPr>
       <w:headerReference w:type="default" r:id="rId6"/>
       <w:headerReference w:type="first" r:id="rId7"/>

</xml_diff>

<commit_message>
style(colors): adopt the standard DBYD/AS 5488 utility colour code app-wide
Replace the utility colour scheme everywhere with the standard locating code:
Cadastral grey, Potable Water blue, Storm Water green, Sewerage cream,
Reclaimed purple, Communications white, Fire Service red, Electrical orange,
Gas yellow, Petroleum brown, Reticulation dark green, Unknown pink.

- legendColors.js is now the single canonical 12-utility list (drives the
  Pothole report legend + utilities table, the annotation editor and the
  pothole panel). Dropped Telstra/Electricity/Recycled/Earth-Grid in favour of
  the standard names; added Cadastral, Petroleum, Reticulation, Fire Service.
- build-photo-report-template.py UTILS matched (keys kept in sync with the tags).
- ServiceLocater + build-service-location-template.py: recoloured the existing
  service-location asset checklist to the matching standard colours.

Both templates rebuilt + previewed; frontend build clean.
</commit_message>
<xml_diff>
--- a/public/templates/photo-report.docx
+++ b/public/templates/photo-report.docx
@@ -901,7 +901,7 @@
         <w:tc>
           <w:tcPr>
             <w:tcW w:w="3400" w:type="dxa"/>
-            <w:shd w:val="clear" w:color="auto" w:fill="F6E84F"/>
+            <w:shd w:val="clear" w:color="auto" w:fill="A6A6A6"/>
             <w:tcMar>
               <w:top w:w="40" w:type="dxa"/>
               <w:left w:w="110" w:type="dxa"/>
@@ -927,7 +927,7 @@
                 <w:b/>
                 <w:color w:val="000000"/>
               </w:rPr>
-              <w:t xml:space="preserve">Gas</w:t>
+              <w:t xml:space="preserve">Cadastral Boundaries</w:t>
             </w:r>
           </w:p>
         </w:tc>
@@ -958,7 +958,7 @@
                 <w:szCs w:val="22"/>
                 <w:color w:val="130C0E"/>
               </w:rPr>
-              <w:t xml:space="preserve">{gas_quality}</w:t>
+              <w:t xml:space="preserve">{cadastral_quality}</w:t>
             </w:r>
           </w:p>
         </w:tc>
@@ -988,7 +988,7 @@
                 <w:szCs w:val="22"/>
                 <w:color w:val="130C0E"/>
               </w:rPr>
-              <w:t xml:space="preserve">{gas_comment}</w:t>
+              <w:t xml:space="preserve">{cadastral_comment}</w:t>
             </w:r>
           </w:p>
         </w:tc>
@@ -997,32 +997,33 @@
         <w:tc>
           <w:tcPr>
             <w:tcW w:w="3400" w:type="dxa"/>
-            <w:tcMar>
-              <w:top w:w="40" w:type="dxa"/>
-              <w:left w:w="110" w:type="dxa"/>
-              <w:bottom w:w="40" w:type="dxa"/>
-              <w:right w:w="110" w:type="dxa"/>
-            </w:tcMar>
-            <w:vAlign w:val="center"/>
-          </w:tcPr>
-          <w:p>
-            <w:pPr>
-              <w:spacing w:after="0" w:line="252" w:lineRule="auto"/>
-              <w:rPr>
-                <w:sz w:val="22"/>
-                <w:szCs w:val="22"/>
-                <w:b/>
-                <w:color w:val="000000"/>
-              </w:rPr>
-            </w:pPr>
-            <w:r>
-              <w:rPr>
-                <w:sz w:val="22"/>
-                <w:szCs w:val="22"/>
-                <w:b/>
-                <w:color w:val="000000"/>
-              </w:rPr>
-              <w:t xml:space="preserve">Telstra</w:t>
+            <w:shd w:val="clear" w:color="auto" w:fill="2E75B6"/>
+            <w:tcMar>
+              <w:top w:w="40" w:type="dxa"/>
+              <w:left w:w="110" w:type="dxa"/>
+              <w:bottom w:w="40" w:type="dxa"/>
+              <w:right w:w="110" w:type="dxa"/>
+            </w:tcMar>
+            <w:vAlign w:val="center"/>
+          </w:tcPr>
+          <w:p>
+            <w:pPr>
+              <w:spacing w:after="0" w:line="252" w:lineRule="auto"/>
+              <w:rPr>
+                <w:sz w:val="22"/>
+                <w:szCs w:val="22"/>
+                <w:b/>
+                <w:color w:val="FFFFFF"/>
+              </w:rPr>
+            </w:pPr>
+            <w:r>
+              <w:rPr>
+                <w:sz w:val="22"/>
+                <w:szCs w:val="22"/>
+                <w:b/>
+                <w:color w:val="FFFFFF"/>
+              </w:rPr>
+              <w:t xml:space="preserve">Potable Water Supply</w:t>
             </w:r>
           </w:p>
         </w:tc>
@@ -1053,7 +1054,7 @@
                 <w:szCs w:val="22"/>
                 <w:color w:val="130C0E"/>
               </w:rPr>
-              <w:t xml:space="preserve">{telstra_quality}</w:t>
+              <w:t xml:space="preserve">{water_quality}</w:t>
             </w:r>
           </w:p>
         </w:tc>
@@ -1083,7 +1084,7 @@
                 <w:szCs w:val="22"/>
                 <w:color w:val="130C0E"/>
               </w:rPr>
-              <w:t xml:space="preserve">{telstra_comment}</w:t>
+              <w:t xml:space="preserve">{water_comment}</w:t>
             </w:r>
           </w:p>
         </w:tc>
@@ -1092,33 +1093,33 @@
         <w:tc>
           <w:tcPr>
             <w:tcW w:w="3400" w:type="dxa"/>
-            <w:shd w:val="clear" w:color="auto" w:fill="F4B183"/>
-            <w:tcMar>
-              <w:top w:w="40" w:type="dxa"/>
-              <w:left w:w="110" w:type="dxa"/>
-              <w:bottom w:w="40" w:type="dxa"/>
-              <w:right w:w="110" w:type="dxa"/>
-            </w:tcMar>
-            <w:vAlign w:val="center"/>
-          </w:tcPr>
-          <w:p>
-            <w:pPr>
-              <w:spacing w:after="0" w:line="252" w:lineRule="auto"/>
-              <w:rPr>
-                <w:sz w:val="22"/>
-                <w:szCs w:val="22"/>
-                <w:b/>
-                <w:color w:val="000000"/>
-              </w:rPr>
-            </w:pPr>
-            <w:r>
-              <w:rPr>
-                <w:sz w:val="22"/>
-                <w:szCs w:val="22"/>
-                <w:b/>
-                <w:color w:val="000000"/>
-              </w:rPr>
-              <w:t xml:space="preserve">Electricity (LV and HV)</w:t>
+            <w:shd w:val="clear" w:color="auto" w:fill="00B050"/>
+            <w:tcMar>
+              <w:top w:w="40" w:type="dxa"/>
+              <w:left w:w="110" w:type="dxa"/>
+              <w:bottom w:w="40" w:type="dxa"/>
+              <w:right w:w="110" w:type="dxa"/>
+            </w:tcMar>
+            <w:vAlign w:val="center"/>
+          </w:tcPr>
+          <w:p>
+            <w:pPr>
+              <w:spacing w:after="0" w:line="252" w:lineRule="auto"/>
+              <w:rPr>
+                <w:sz w:val="22"/>
+                <w:szCs w:val="22"/>
+                <w:b/>
+                <w:color w:val="FFFFFF"/>
+              </w:rPr>
+            </w:pPr>
+            <w:r>
+              <w:rPr>
+                <w:sz w:val="22"/>
+                <w:szCs w:val="22"/>
+                <w:b/>
+                <w:color w:val="FFFFFF"/>
+              </w:rPr>
+              <w:t xml:space="preserve">Storm Water</w:t>
             </w:r>
           </w:p>
         </w:tc>
@@ -1149,7 +1150,7 @@
                 <w:szCs w:val="22"/>
                 <w:color w:val="130C0E"/>
               </w:rPr>
-              <w:t xml:space="preserve">{electricity_quality}</w:t>
+              <w:t xml:space="preserve">{stormwater_quality}</w:t>
             </w:r>
           </w:p>
         </w:tc>
@@ -1179,7 +1180,7 @@
                 <w:szCs w:val="22"/>
                 <w:color w:val="130C0E"/>
               </w:rPr>
-              <w:t xml:space="preserve">{electricity_comment}</w:t>
+              <w:t xml:space="preserve">{stormwater_comment}</w:t>
             </w:r>
           </w:p>
         </w:tc>
@@ -1188,6 +1189,7 @@
         <w:tc>
           <w:tcPr>
             <w:tcW w:w="3400" w:type="dxa"/>
+            <w:shd w:val="clear" w:color="auto" w:fill="F2E2C4"/>
             <w:tcMar>
               <w:top w:w="40" w:type="dxa"/>
               <w:left w:w="110" w:type="dxa"/>
@@ -1213,7 +1215,7 @@
                 <w:b/>
                 <w:color w:val="000000"/>
               </w:rPr>
-              <w:t xml:space="preserve">Communications / Fibre Optic</w:t>
+              <w:t xml:space="preserve">Sewerage</w:t>
             </w:r>
           </w:p>
         </w:tc>
@@ -1244,7 +1246,7 @@
                 <w:szCs w:val="22"/>
                 <w:color w:val="130C0E"/>
               </w:rPr>
-              <w:t xml:space="preserve">{comms_quality}</w:t>
+              <w:t xml:space="preserve">{sewer_quality}</w:t>
             </w:r>
           </w:p>
         </w:tc>
@@ -1274,7 +1276,7 @@
                 <w:szCs w:val="22"/>
                 <w:color w:val="130C0E"/>
               </w:rPr>
-              <w:t xml:space="preserve">{comms_comment}</w:t>
+              <w:t xml:space="preserve">{sewer_comment}</w:t>
             </w:r>
           </w:p>
         </w:tc>
@@ -1283,33 +1285,33 @@
         <w:tc>
           <w:tcPr>
             <w:tcW w:w="3400" w:type="dxa"/>
-            <w:shd w:val="clear" w:color="auto" w:fill="8EAADB"/>
-            <w:tcMar>
-              <w:top w:w="40" w:type="dxa"/>
-              <w:left w:w="110" w:type="dxa"/>
-              <w:bottom w:w="40" w:type="dxa"/>
-              <w:right w:w="110" w:type="dxa"/>
-            </w:tcMar>
-            <w:vAlign w:val="center"/>
-          </w:tcPr>
-          <w:p>
-            <w:pPr>
-              <w:spacing w:after="0" w:line="252" w:lineRule="auto"/>
-              <w:rPr>
-                <w:sz w:val="22"/>
-                <w:szCs w:val="22"/>
-                <w:b/>
-                <w:color w:val="000000"/>
-              </w:rPr>
-            </w:pPr>
-            <w:r>
-              <w:rPr>
-                <w:sz w:val="22"/>
-                <w:szCs w:val="22"/>
-                <w:b/>
-                <w:color w:val="000000"/>
-              </w:rPr>
-              <w:t xml:space="preserve">Water</w:t>
+            <w:shd w:val="clear" w:color="auto" w:fill="7030A0"/>
+            <w:tcMar>
+              <w:top w:w="40" w:type="dxa"/>
+              <w:left w:w="110" w:type="dxa"/>
+              <w:bottom w:w="40" w:type="dxa"/>
+              <w:right w:w="110" w:type="dxa"/>
+            </w:tcMar>
+            <w:vAlign w:val="center"/>
+          </w:tcPr>
+          <w:p>
+            <w:pPr>
+              <w:spacing w:after="0" w:line="252" w:lineRule="auto"/>
+              <w:rPr>
+                <w:sz w:val="22"/>
+                <w:szCs w:val="22"/>
+                <w:b/>
+                <w:color w:val="FFFFFF"/>
+              </w:rPr>
+            </w:pPr>
+            <w:r>
+              <w:rPr>
+                <w:sz w:val="22"/>
+                <w:szCs w:val="22"/>
+                <w:b/>
+                <w:color w:val="FFFFFF"/>
+              </w:rPr>
+              <w:t xml:space="preserve">Reclaimed Water</w:t>
             </w:r>
           </w:p>
         </w:tc>
@@ -1340,7 +1342,7 @@
                 <w:szCs w:val="22"/>
                 <w:color w:val="130C0E"/>
               </w:rPr>
-              <w:t xml:space="preserve">{water_quality}</w:t>
+              <w:t xml:space="preserve">{reclaimed_quality}</w:t>
             </w:r>
           </w:p>
         </w:tc>
@@ -1370,7 +1372,7 @@
                 <w:szCs w:val="22"/>
                 <w:color w:val="130C0E"/>
               </w:rPr>
-              <w:t xml:space="preserve">{water_comment}</w:t>
+              <w:t xml:space="preserve">{reclaimed_comment}</w:t>
             </w:r>
           </w:p>
         </w:tc>
@@ -1379,7 +1381,6 @@
         <w:tc>
           <w:tcPr>
             <w:tcW w:w="3400" w:type="dxa"/>
-            <w:shd w:val="clear" w:color="auto" w:fill="FBE4D5"/>
             <w:tcMar>
               <w:top w:w="40" w:type="dxa"/>
               <w:left w:w="110" w:type="dxa"/>
@@ -1405,7 +1406,7 @@
                 <w:b/>
                 <w:color w:val="000000"/>
               </w:rPr>
-              <w:t xml:space="preserve">Sewer</w:t>
+              <w:t xml:space="preserve">Communications</w:t>
             </w:r>
           </w:p>
         </w:tc>
@@ -1436,7 +1437,7 @@
                 <w:szCs w:val="22"/>
                 <w:color w:val="130C0E"/>
               </w:rPr>
-              <w:t xml:space="preserve">{sewer_quality}</w:t>
+              <w:t xml:space="preserve">{comms_quality}</w:t>
             </w:r>
           </w:p>
         </w:tc>
@@ -1466,7 +1467,7 @@
                 <w:szCs w:val="22"/>
                 <w:color w:val="130C0E"/>
               </w:rPr>
-              <w:t xml:space="preserve">{sewer_comment}</w:t>
+              <w:t xml:space="preserve">{comms_comment}</w:t>
             </w:r>
           </w:p>
         </w:tc>
@@ -1475,33 +1476,33 @@
         <w:tc>
           <w:tcPr>
             <w:tcW w:w="3400" w:type="dxa"/>
-            <w:shd w:val="clear" w:color="auto" w:fill="92D050"/>
-            <w:tcMar>
-              <w:top w:w="40" w:type="dxa"/>
-              <w:left w:w="110" w:type="dxa"/>
-              <w:bottom w:w="40" w:type="dxa"/>
-              <w:right w:w="110" w:type="dxa"/>
-            </w:tcMar>
-            <w:vAlign w:val="center"/>
-          </w:tcPr>
-          <w:p>
-            <w:pPr>
-              <w:spacing w:after="0" w:line="252" w:lineRule="auto"/>
-              <w:rPr>
-                <w:sz w:val="22"/>
-                <w:szCs w:val="22"/>
-                <w:b/>
-                <w:color w:val="000000"/>
-              </w:rPr>
-            </w:pPr>
-            <w:r>
-              <w:rPr>
-                <w:sz w:val="22"/>
-                <w:szCs w:val="22"/>
-                <w:b/>
-                <w:color w:val="000000"/>
-              </w:rPr>
-              <w:t xml:space="preserve">Stormwater</w:t>
+            <w:shd w:val="clear" w:color="auto" w:fill="FF0000"/>
+            <w:tcMar>
+              <w:top w:w="40" w:type="dxa"/>
+              <w:left w:w="110" w:type="dxa"/>
+              <w:bottom w:w="40" w:type="dxa"/>
+              <w:right w:w="110" w:type="dxa"/>
+            </w:tcMar>
+            <w:vAlign w:val="center"/>
+          </w:tcPr>
+          <w:p>
+            <w:pPr>
+              <w:spacing w:after="0" w:line="252" w:lineRule="auto"/>
+              <w:rPr>
+                <w:sz w:val="22"/>
+                <w:szCs w:val="22"/>
+                <w:b/>
+                <w:color w:val="FFFFFF"/>
+              </w:rPr>
+            </w:pPr>
+            <w:r>
+              <w:rPr>
+                <w:sz w:val="22"/>
+                <w:szCs w:val="22"/>
+                <w:b/>
+                <w:color w:val="FFFFFF"/>
+              </w:rPr>
+              <w:t xml:space="preserve">Fire Service</w:t>
             </w:r>
           </w:p>
         </w:tc>
@@ -1532,7 +1533,7 @@
                 <w:szCs w:val="22"/>
                 <w:color w:val="130C0E"/>
               </w:rPr>
-              <w:t xml:space="preserve">{stormwater_quality}</w:t>
+              <w:t xml:space="preserve">{fire_quality}</w:t>
             </w:r>
           </w:p>
         </w:tc>
@@ -1562,7 +1563,7 @@
                 <w:szCs w:val="22"/>
                 <w:color w:val="130C0E"/>
               </w:rPr>
-              <w:t xml:space="preserve">{stormwater_comment}</w:t>
+              <w:t xml:space="preserve">{fire_comment}</w:t>
             </w:r>
           </w:p>
         </w:tc>
@@ -1571,7 +1572,7 @@
         <w:tc>
           <w:tcPr>
             <w:tcW w:w="3400" w:type="dxa"/>
-            <w:shd w:val="clear" w:color="auto" w:fill="D777C5"/>
+            <w:shd w:val="clear" w:color="auto" w:fill="ED7D31"/>
             <w:tcMar>
               <w:top w:w="40" w:type="dxa"/>
               <w:left w:w="110" w:type="dxa"/>
@@ -1597,7 +1598,7 @@
                 <w:b/>
                 <w:color w:val="000000"/>
               </w:rPr>
-              <w:t xml:space="preserve">Recycled Water</w:t>
+              <w:t xml:space="preserve">Electrical</w:t>
             </w:r>
           </w:p>
         </w:tc>
@@ -1628,7 +1629,7 @@
                 <w:szCs w:val="22"/>
                 <w:color w:val="130C0E"/>
               </w:rPr>
-              <w:t xml:space="preserve">{recycled_quality}</w:t>
+              <w:t xml:space="preserve">{electrical_quality}</w:t>
             </w:r>
           </w:p>
         </w:tc>
@@ -1658,7 +1659,7 @@
                 <w:szCs w:val="22"/>
                 <w:color w:val="130C0E"/>
               </w:rPr>
-              <w:t xml:space="preserve">{recycled_comment}</w:t>
+              <w:t xml:space="preserve">{electrical_comment}</w:t>
             </w:r>
           </w:p>
         </w:tc>
@@ -1667,7 +1668,7 @@
         <w:tc>
           <w:tcPr>
             <w:tcW w:w="3400" w:type="dxa"/>
-            <w:shd w:val="clear" w:color="auto" w:fill="FF3399"/>
+            <w:shd w:val="clear" w:color="auto" w:fill="FFD500"/>
             <w:tcMar>
               <w:top w:w="40" w:type="dxa"/>
               <w:left w:w="110" w:type="dxa"/>
@@ -1693,7 +1694,7 @@
                 <w:b/>
                 <w:color w:val="000000"/>
               </w:rPr>
-              <w:t xml:space="preserve">Unknown Service</w:t>
+              <w:t xml:space="preserve">Gas</w:t>
             </w:r>
           </w:p>
         </w:tc>
@@ -1724,7 +1725,7 @@
                 <w:szCs w:val="22"/>
                 <w:color w:val="130C0E"/>
               </w:rPr>
-              <w:t xml:space="preserve">{unknown_quality}</w:t>
+              <w:t xml:space="preserve">{gas_quality}</w:t>
             </w:r>
           </w:p>
         </w:tc>
@@ -1754,7 +1755,7 @@
                 <w:szCs w:val="22"/>
                 <w:color w:val="130C0E"/>
               </w:rPr>
-              <w:t xml:space="preserve">{unknown_comment}</w:t>
+              <w:t xml:space="preserve">{gas_comment}</w:t>
             </w:r>
           </w:p>
         </w:tc>
@@ -1763,7 +1764,199 @@
         <w:tc>
           <w:tcPr>
             <w:tcW w:w="3400" w:type="dxa"/>
-            <w:shd w:val="clear" w:color="auto" w:fill="FFFF00"/>
+            <w:shd w:val="clear" w:color="auto" w:fill="974706"/>
+            <w:tcMar>
+              <w:top w:w="40" w:type="dxa"/>
+              <w:left w:w="110" w:type="dxa"/>
+              <w:bottom w:w="40" w:type="dxa"/>
+              <w:right w:w="110" w:type="dxa"/>
+            </w:tcMar>
+            <w:vAlign w:val="center"/>
+          </w:tcPr>
+          <w:p>
+            <w:pPr>
+              <w:spacing w:after="0" w:line="252" w:lineRule="auto"/>
+              <w:rPr>
+                <w:sz w:val="22"/>
+                <w:szCs w:val="22"/>
+                <w:b/>
+                <w:color w:val="FFFFFF"/>
+              </w:rPr>
+            </w:pPr>
+            <w:r>
+              <w:rPr>
+                <w:sz w:val="22"/>
+                <w:szCs w:val="22"/>
+                <w:b/>
+                <w:color w:val="FFFFFF"/>
+              </w:rPr>
+              <w:t xml:space="preserve">Petroleum</w:t>
+            </w:r>
+          </w:p>
+        </w:tc>
+        <w:tc>
+          <w:tcPr>
+            <w:tcW w:w="1700" w:type="dxa"/>
+            <w:tcMar>
+              <w:top w:w="40" w:type="dxa"/>
+              <w:left w:w="110" w:type="dxa"/>
+              <w:bottom w:w="40" w:type="dxa"/>
+              <w:right w:w="110" w:type="dxa"/>
+            </w:tcMar>
+            <w:vAlign w:val="center"/>
+          </w:tcPr>
+          <w:p>
+            <w:pPr>
+              <w:spacing w:after="0" w:line="252" w:lineRule="auto"/>
+              <w:jc w:val="center"/>
+              <w:rPr>
+                <w:sz w:val="22"/>
+                <w:szCs w:val="22"/>
+                <w:color w:val="130C0E"/>
+              </w:rPr>
+            </w:pPr>
+            <w:r>
+              <w:rPr>
+                <w:sz w:val="22"/>
+                <w:szCs w:val="22"/>
+                <w:color w:val="130C0E"/>
+              </w:rPr>
+              <w:t xml:space="preserve">{petroleum_quality}</w:t>
+            </w:r>
+          </w:p>
+        </w:tc>
+        <w:tc>
+          <w:tcPr>
+            <w:tcW w:w="4986" w:type="dxa"/>
+            <w:tcMar>
+              <w:top w:w="40" w:type="dxa"/>
+              <w:left w:w="110" w:type="dxa"/>
+              <w:bottom w:w="40" w:type="dxa"/>
+              <w:right w:w="110" w:type="dxa"/>
+            </w:tcMar>
+            <w:vAlign w:val="center"/>
+          </w:tcPr>
+          <w:p>
+            <w:pPr>
+              <w:spacing w:after="0" w:line="252" w:lineRule="auto"/>
+              <w:rPr>
+                <w:sz w:val="22"/>
+                <w:szCs w:val="22"/>
+                <w:color w:val="130C0E"/>
+              </w:rPr>
+            </w:pPr>
+            <w:r>
+              <w:rPr>
+                <w:sz w:val="22"/>
+                <w:szCs w:val="22"/>
+                <w:color w:val="130C0E"/>
+              </w:rPr>
+              <w:t xml:space="preserve">{petroleum_comment}</w:t>
+            </w:r>
+          </w:p>
+        </w:tc>
+      </w:tr>
+      <w:tr>
+        <w:tc>
+          <w:tcPr>
+            <w:tcW w:w="3400" w:type="dxa"/>
+            <w:shd w:val="clear" w:color="auto" w:fill="375623"/>
+            <w:tcMar>
+              <w:top w:w="40" w:type="dxa"/>
+              <w:left w:w="110" w:type="dxa"/>
+              <w:bottom w:w="40" w:type="dxa"/>
+              <w:right w:w="110" w:type="dxa"/>
+            </w:tcMar>
+            <w:vAlign w:val="center"/>
+          </w:tcPr>
+          <w:p>
+            <w:pPr>
+              <w:spacing w:after="0" w:line="252" w:lineRule="auto"/>
+              <w:rPr>
+                <w:sz w:val="22"/>
+                <w:szCs w:val="22"/>
+                <w:b/>
+                <w:color w:val="FFFFFF"/>
+              </w:rPr>
+            </w:pPr>
+            <w:r>
+              <w:rPr>
+                <w:sz w:val="22"/>
+                <w:szCs w:val="22"/>
+                <w:b/>
+                <w:color w:val="FFFFFF"/>
+              </w:rPr>
+              <w:t xml:space="preserve">Reticulation</w:t>
+            </w:r>
+          </w:p>
+        </w:tc>
+        <w:tc>
+          <w:tcPr>
+            <w:tcW w:w="1700" w:type="dxa"/>
+            <w:tcMar>
+              <w:top w:w="40" w:type="dxa"/>
+              <w:left w:w="110" w:type="dxa"/>
+              <w:bottom w:w="40" w:type="dxa"/>
+              <w:right w:w="110" w:type="dxa"/>
+            </w:tcMar>
+            <w:vAlign w:val="center"/>
+          </w:tcPr>
+          <w:p>
+            <w:pPr>
+              <w:spacing w:after="0" w:line="252" w:lineRule="auto"/>
+              <w:jc w:val="center"/>
+              <w:rPr>
+                <w:sz w:val="22"/>
+                <w:szCs w:val="22"/>
+                <w:color w:val="130C0E"/>
+              </w:rPr>
+            </w:pPr>
+            <w:r>
+              <w:rPr>
+                <w:sz w:val="22"/>
+                <w:szCs w:val="22"/>
+                <w:color w:val="130C0E"/>
+              </w:rPr>
+              <w:t xml:space="preserve">{reticulation_quality}</w:t>
+            </w:r>
+          </w:p>
+        </w:tc>
+        <w:tc>
+          <w:tcPr>
+            <w:tcW w:w="4986" w:type="dxa"/>
+            <w:tcMar>
+              <w:top w:w="40" w:type="dxa"/>
+              <w:left w:w="110" w:type="dxa"/>
+              <w:bottom w:w="40" w:type="dxa"/>
+              <w:right w:w="110" w:type="dxa"/>
+            </w:tcMar>
+            <w:vAlign w:val="center"/>
+          </w:tcPr>
+          <w:p>
+            <w:pPr>
+              <w:spacing w:after="0" w:line="252" w:lineRule="auto"/>
+              <w:rPr>
+                <w:sz w:val="22"/>
+                <w:szCs w:val="22"/>
+                <w:color w:val="130C0E"/>
+              </w:rPr>
+            </w:pPr>
+            <w:r>
+              <w:rPr>
+                <w:sz w:val="22"/>
+                <w:szCs w:val="22"/>
+                <w:color w:val="130C0E"/>
+              </w:rPr>
+              <w:t xml:space="preserve">{reticulation_comment}</w:t>
+            </w:r>
+          </w:p>
+        </w:tc>
+      </w:tr>
+      <w:tr>
+        <w:tc>
+          <w:tcPr>
+            <w:tcW w:w="3400" w:type="dxa"/>
+            <w:shd w:val="clear" w:color="auto" w:fill="FF66CC"/>
             <w:tcMar>
               <w:top w:w="40" w:type="dxa"/>
               <w:left w:w="110" w:type="dxa"/>
@@ -1789,7 +1982,7 @@
                 <w:b/>
                 <w:color w:val="000000"/>
               </w:rPr>
-              <w:t xml:space="preserve">Earth Grid (Substation)</w:t>
+              <w:t xml:space="preserve">Unknown Services</w:t>
             </w:r>
           </w:p>
         </w:tc>
@@ -1820,7 +2013,7 @@
                 <w:szCs w:val="22"/>
                 <w:color w:val="130C0E"/>
               </w:rPr>
-              <w:t xml:space="preserve">{earth_quality}</w:t>
+              <w:t xml:space="preserve">{unknown_quality}</w:t>
             </w:r>
           </w:p>
         </w:tc>
@@ -1850,7 +2043,7 @@
                 <w:szCs w:val="22"/>
                 <w:color w:val="130C0E"/>
               </w:rPr>
-              <w:t xml:space="preserve">{earth_comment}</w:t>
+              <w:t xml:space="preserve">{unknown_comment}</w:t>
             </w:r>
           </w:p>
         </w:tc>
@@ -1943,7 +2136,7 @@
         <w:tc>
           <w:tcPr>
             <w:tcW w:w="1900" w:type="dxa"/>
-            <w:shd w:val="clear" w:color="auto" w:fill="F6E84F"/>
+            <w:shd w:val="clear" w:color="auto" w:fill="A6A6A6"/>
             <w:tcMar>
               <w:top w:w="40" w:type="dxa"/>
               <w:left w:w="110" w:type="dxa"/>
@@ -1970,7 +2163,7 @@
                 <w:b/>
                 <w:color w:val="000000"/>
               </w:rPr>
-              <w:t xml:space="preserve">G, GM, GS</w:t>
+              <w:t xml:space="preserve">CAD</w:t>
             </w:r>
           </w:p>
         </w:tc>
@@ -2000,7 +2193,7 @@
                 <w:szCs w:val="22"/>
                 <w:color w:val="130C0E"/>
               </w:rPr>
-              <w:t xml:space="preserve">Gas</w:t>
+              <w:t xml:space="preserve">Cadastral Boundaries</w:t>
             </w:r>
           </w:p>
         </w:tc>
@@ -2009,7 +2202,7 @@
         <w:tc>
           <w:tcPr>
             <w:tcW w:w="1900" w:type="dxa"/>
-            <w:shd w:val="clear" w:color="auto" w:fill="FFFFFF"/>
+            <w:shd w:val="clear" w:color="auto" w:fill="2E75B6"/>
             <w:tcMar>
               <w:top w:w="40" w:type="dxa"/>
               <w:left w:w="110" w:type="dxa"/>
@@ -2026,17 +2219,17 @@
                 <w:sz w:val="22"/>
                 <w:szCs w:val="22"/>
                 <w:b/>
-                <w:color w:val="000000"/>
-              </w:rPr>
-            </w:pPr>
-            <w:r>
-              <w:rPr>
-                <w:sz w:val="22"/>
-                <w:szCs w:val="22"/>
-                <w:b/>
-                <w:color w:val="000000"/>
-              </w:rPr>
-              <w:t xml:space="preserve">T</w:t>
+                <w:color w:val="FFFFFF"/>
+              </w:rPr>
+            </w:pPr>
+            <w:r>
+              <w:rPr>
+                <w:sz w:val="22"/>
+                <w:szCs w:val="22"/>
+                <w:b/>
+                <w:color w:val="FFFFFF"/>
+              </w:rPr>
+              <w:t xml:space="preserve">WS, WM, W</w:t>
             </w:r>
           </w:p>
         </w:tc>
@@ -2066,7 +2259,7 @@
                 <w:szCs w:val="22"/>
                 <w:color w:val="130C0E"/>
               </w:rPr>
-              <w:t xml:space="preserve">Telstra</w:t>
+              <w:t xml:space="preserve">Potable Water Supply</w:t>
             </w:r>
           </w:p>
         </w:tc>
@@ -2075,7 +2268,7 @@
         <w:tc>
           <w:tcPr>
             <w:tcW w:w="1900" w:type="dxa"/>
-            <w:shd w:val="clear" w:color="auto" w:fill="F4B183"/>
+            <w:shd w:val="clear" w:color="auto" w:fill="00B050"/>
             <w:tcMar>
               <w:top w:w="40" w:type="dxa"/>
               <w:left w:w="110" w:type="dxa"/>
@@ -2092,17 +2285,17 @@
                 <w:sz w:val="22"/>
                 <w:szCs w:val="22"/>
                 <w:b/>
-                <w:color w:val="000000"/>
-              </w:rPr>
-            </w:pPr>
-            <w:r>
-              <w:rPr>
-                <w:sz w:val="22"/>
-                <w:szCs w:val="22"/>
-                <w:b/>
-                <w:color w:val="000000"/>
-              </w:rPr>
-              <w:t xml:space="preserve">HV, LV, E</w:t>
+                <w:color w:val="FFFFFF"/>
+              </w:rPr>
+            </w:pPr>
+            <w:r>
+              <w:rPr>
+                <w:sz w:val="22"/>
+                <w:szCs w:val="22"/>
+                <w:b/>
+                <w:color w:val="FFFFFF"/>
+              </w:rPr>
+              <w:t xml:space="preserve">STW</w:t>
             </w:r>
           </w:p>
         </w:tc>
@@ -2132,7 +2325,7 @@
                 <w:szCs w:val="22"/>
                 <w:color w:val="130C0E"/>
               </w:rPr>
-              <w:t xml:space="preserve">Electricity (LV and HV)</w:t>
+              <w:t xml:space="preserve">Storm Water</w:t>
             </w:r>
           </w:p>
         </w:tc>
@@ -2141,7 +2334,7 @@
         <w:tc>
           <w:tcPr>
             <w:tcW w:w="1900" w:type="dxa"/>
-            <w:shd w:val="clear" w:color="auto" w:fill="FFFFFF"/>
+            <w:shd w:val="clear" w:color="auto" w:fill="F2E2C4"/>
             <w:tcMar>
               <w:top w:w="40" w:type="dxa"/>
               <w:left w:w="110" w:type="dxa"/>
@@ -2168,7 +2361,7 @@
                 <w:b/>
                 <w:color w:val="000000"/>
               </w:rPr>
-              <w:t xml:space="preserve">COMMS, OF</w:t>
+              <w:t xml:space="preserve">SWR</w:t>
             </w:r>
           </w:p>
         </w:tc>
@@ -2198,7 +2391,7 @@
                 <w:szCs w:val="22"/>
                 <w:color w:val="130C0E"/>
               </w:rPr>
-              <w:t xml:space="preserve">Communications / Fibre Optic</w:t>
+              <w:t xml:space="preserve">Sewerage</w:t>
             </w:r>
           </w:p>
         </w:tc>
@@ -2207,7 +2400,7 @@
         <w:tc>
           <w:tcPr>
             <w:tcW w:w="1900" w:type="dxa"/>
-            <w:shd w:val="clear" w:color="auto" w:fill="8EAADB"/>
+            <w:shd w:val="clear" w:color="auto" w:fill="7030A0"/>
             <w:tcMar>
               <w:top w:w="40" w:type="dxa"/>
               <w:left w:w="110" w:type="dxa"/>
@@ -2224,17 +2417,17 @@
                 <w:sz w:val="22"/>
                 <w:szCs w:val="22"/>
                 <w:b/>
-                <w:color w:val="000000"/>
-              </w:rPr>
-            </w:pPr>
-            <w:r>
-              <w:rPr>
-                <w:sz w:val="22"/>
-                <w:szCs w:val="22"/>
-                <w:b/>
-                <w:color w:val="000000"/>
-              </w:rPr>
-              <w:t xml:space="preserve">WS, WM, W</w:t>
+                <w:color w:val="FFFFFF"/>
+              </w:rPr>
+            </w:pPr>
+            <w:r>
+              <w:rPr>
+                <w:sz w:val="22"/>
+                <w:szCs w:val="22"/>
+                <w:b/>
+                <w:color w:val="FFFFFF"/>
+              </w:rPr>
+              <w:t xml:space="preserve">RW</w:t>
             </w:r>
           </w:p>
         </w:tc>
@@ -2264,7 +2457,7 @@
                 <w:szCs w:val="22"/>
                 <w:color w:val="130C0E"/>
               </w:rPr>
-              <w:t xml:space="preserve">Water</w:t>
+              <w:t xml:space="preserve">Reclaimed Water</w:t>
             </w:r>
           </w:p>
         </w:tc>
@@ -2273,7 +2466,7 @@
         <w:tc>
           <w:tcPr>
             <w:tcW w:w="1900" w:type="dxa"/>
-            <w:shd w:val="clear" w:color="auto" w:fill="FBE4D5"/>
+            <w:shd w:val="clear" w:color="auto" w:fill="FFFFFF"/>
             <w:tcMar>
               <w:top w:w="40" w:type="dxa"/>
               <w:left w:w="110" w:type="dxa"/>
@@ -2300,7 +2493,7 @@
                 <w:b/>
                 <w:color w:val="000000"/>
               </w:rPr>
-              <w:t xml:space="preserve">SWR</w:t>
+              <w:t xml:space="preserve">COMMS</w:t>
             </w:r>
           </w:p>
         </w:tc>
@@ -2330,7 +2523,7 @@
                 <w:szCs w:val="22"/>
                 <w:color w:val="130C0E"/>
               </w:rPr>
-              <w:t xml:space="preserve">Sewer</w:t>
+              <w:t xml:space="preserve">Communications</w:t>
             </w:r>
           </w:p>
         </w:tc>
@@ -2339,7 +2532,7 @@
         <w:tc>
           <w:tcPr>
             <w:tcW w:w="1900" w:type="dxa"/>
-            <w:shd w:val="clear" w:color="auto" w:fill="92D050"/>
+            <w:shd w:val="clear" w:color="auto" w:fill="FF0000"/>
             <w:tcMar>
               <w:top w:w="40" w:type="dxa"/>
               <w:left w:w="110" w:type="dxa"/>
@@ -2356,17 +2549,17 @@
                 <w:sz w:val="22"/>
                 <w:szCs w:val="22"/>
                 <w:b/>
-                <w:color w:val="000000"/>
-              </w:rPr>
-            </w:pPr>
-            <w:r>
-              <w:rPr>
-                <w:sz w:val="22"/>
-                <w:szCs w:val="22"/>
-                <w:b/>
-                <w:color w:val="000000"/>
-              </w:rPr>
-              <w:t xml:space="preserve">STW</w:t>
+                <w:color w:val="FFFFFF"/>
+              </w:rPr>
+            </w:pPr>
+            <w:r>
+              <w:rPr>
+                <w:sz w:val="22"/>
+                <w:szCs w:val="22"/>
+                <w:b/>
+                <w:color w:val="FFFFFF"/>
+              </w:rPr>
+              <w:t xml:space="preserve">FS</w:t>
             </w:r>
           </w:p>
         </w:tc>
@@ -2396,7 +2589,7 @@
                 <w:szCs w:val="22"/>
                 <w:color w:val="130C0E"/>
               </w:rPr>
-              <w:t xml:space="preserve">Stormwater</w:t>
+              <w:t xml:space="preserve">Fire Service</w:t>
             </w:r>
           </w:p>
         </w:tc>
@@ -2405,7 +2598,7 @@
         <w:tc>
           <w:tcPr>
             <w:tcW w:w="1900" w:type="dxa"/>
-            <w:shd w:val="clear" w:color="auto" w:fill="D777C5"/>
+            <w:shd w:val="clear" w:color="auto" w:fill="ED7D31"/>
             <w:tcMar>
               <w:top w:w="40" w:type="dxa"/>
               <w:left w:w="110" w:type="dxa"/>
@@ -2432,7 +2625,7 @@
                 <w:b/>
                 <w:color w:val="000000"/>
               </w:rPr>
-              <w:t xml:space="preserve">RW</w:t>
+              <w:t xml:space="preserve">HV, LV, E</w:t>
             </w:r>
           </w:p>
         </w:tc>
@@ -2462,7 +2655,7 @@
                 <w:szCs w:val="22"/>
                 <w:color w:val="130C0E"/>
               </w:rPr>
-              <w:t xml:space="preserve">Recycled Water</w:t>
+              <w:t xml:space="preserve">Electrical</w:t>
             </w:r>
           </w:p>
         </w:tc>
@@ -2471,7 +2664,7 @@
         <w:tc>
           <w:tcPr>
             <w:tcW w:w="1900" w:type="dxa"/>
-            <w:shd w:val="clear" w:color="auto" w:fill="FF3399"/>
+            <w:shd w:val="clear" w:color="auto" w:fill="FFD500"/>
             <w:tcMar>
               <w:top w:w="40" w:type="dxa"/>
               <w:left w:w="110" w:type="dxa"/>
@@ -2498,7 +2691,7 @@
                 <w:b/>
                 <w:color w:val="000000"/>
               </w:rPr>
-              <w:t xml:space="preserve">UK</w:t>
+              <w:t xml:space="preserve">G, GM, GS</w:t>
             </w:r>
           </w:p>
         </w:tc>
@@ -2528,7 +2721,7 @@
                 <w:szCs w:val="22"/>
                 <w:color w:val="130C0E"/>
               </w:rPr>
-              <w:t xml:space="preserve">Unknown Service</w:t>
+              <w:t xml:space="preserve">Gas</w:t>
             </w:r>
           </w:p>
         </w:tc>
@@ -2537,7 +2730,7 @@
         <w:tc>
           <w:tcPr>
             <w:tcW w:w="1900" w:type="dxa"/>
-            <w:shd w:val="clear" w:color="auto" w:fill="FFFF00"/>
+            <w:shd w:val="clear" w:color="auto" w:fill="974706"/>
             <w:tcMar>
               <w:top w:w="40" w:type="dxa"/>
               <w:left w:w="110" w:type="dxa"/>
@@ -2554,6 +2747,138 @@
                 <w:sz w:val="22"/>
                 <w:szCs w:val="22"/>
                 <w:b/>
+                <w:color w:val="FFFFFF"/>
+              </w:rPr>
+            </w:pPr>
+            <w:r>
+              <w:rPr>
+                <w:sz w:val="22"/>
+                <w:szCs w:val="22"/>
+                <w:b/>
+                <w:color w:val="FFFFFF"/>
+              </w:rPr>
+              <w:t xml:space="preserve">P</w:t>
+            </w:r>
+          </w:p>
+        </w:tc>
+        <w:tc>
+          <w:tcPr>
+            <w:tcW w:w="8186" w:type="dxa"/>
+            <w:tcMar>
+              <w:top w:w="40" w:type="dxa"/>
+              <w:left w:w="110" w:type="dxa"/>
+              <w:bottom w:w="40" w:type="dxa"/>
+              <w:right w:w="110" w:type="dxa"/>
+            </w:tcMar>
+            <w:vAlign w:val="center"/>
+          </w:tcPr>
+          <w:p>
+            <w:pPr>
+              <w:spacing w:after="0" w:line="252" w:lineRule="auto"/>
+              <w:rPr>
+                <w:sz w:val="22"/>
+                <w:szCs w:val="22"/>
+                <w:color w:val="130C0E"/>
+              </w:rPr>
+            </w:pPr>
+            <w:r>
+              <w:rPr>
+                <w:sz w:val="22"/>
+                <w:szCs w:val="22"/>
+                <w:color w:val="130C0E"/>
+              </w:rPr>
+              <w:t xml:space="preserve">Petroleum</w:t>
+            </w:r>
+          </w:p>
+        </w:tc>
+      </w:tr>
+      <w:tr>
+        <w:tc>
+          <w:tcPr>
+            <w:tcW w:w="1900" w:type="dxa"/>
+            <w:shd w:val="clear" w:color="auto" w:fill="375623"/>
+            <w:tcMar>
+              <w:top w:w="40" w:type="dxa"/>
+              <w:left w:w="110" w:type="dxa"/>
+              <w:bottom w:w="40" w:type="dxa"/>
+              <w:right w:w="110" w:type="dxa"/>
+            </w:tcMar>
+            <w:vAlign w:val="center"/>
+          </w:tcPr>
+          <w:p>
+            <w:pPr>
+              <w:spacing w:after="0" w:line="252" w:lineRule="auto"/>
+              <w:jc w:val="center"/>
+              <w:rPr>
+                <w:sz w:val="22"/>
+                <w:szCs w:val="22"/>
+                <w:b/>
+                <w:color w:val="FFFFFF"/>
+              </w:rPr>
+            </w:pPr>
+            <w:r>
+              <w:rPr>
+                <w:sz w:val="22"/>
+                <w:szCs w:val="22"/>
+                <w:b/>
+                <w:color w:val="FFFFFF"/>
+              </w:rPr>
+              <w:t xml:space="preserve">RET</w:t>
+            </w:r>
+          </w:p>
+        </w:tc>
+        <w:tc>
+          <w:tcPr>
+            <w:tcW w:w="8186" w:type="dxa"/>
+            <w:tcMar>
+              <w:top w:w="40" w:type="dxa"/>
+              <w:left w:w="110" w:type="dxa"/>
+              <w:bottom w:w="40" w:type="dxa"/>
+              <w:right w:w="110" w:type="dxa"/>
+            </w:tcMar>
+            <w:vAlign w:val="center"/>
+          </w:tcPr>
+          <w:p>
+            <w:pPr>
+              <w:spacing w:after="0" w:line="252" w:lineRule="auto"/>
+              <w:rPr>
+                <w:sz w:val="22"/>
+                <w:szCs w:val="22"/>
+                <w:color w:val="130C0E"/>
+              </w:rPr>
+            </w:pPr>
+            <w:r>
+              <w:rPr>
+                <w:sz w:val="22"/>
+                <w:szCs w:val="22"/>
+                <w:color w:val="130C0E"/>
+              </w:rPr>
+              <w:t xml:space="preserve">Reticulation</w:t>
+            </w:r>
+          </w:p>
+        </w:tc>
+      </w:tr>
+      <w:tr>
+        <w:tc>
+          <w:tcPr>
+            <w:tcW w:w="1900" w:type="dxa"/>
+            <w:shd w:val="clear" w:color="auto" w:fill="FF66CC"/>
+            <w:tcMar>
+              <w:top w:w="40" w:type="dxa"/>
+              <w:left w:w="110" w:type="dxa"/>
+              <w:bottom w:w="40" w:type="dxa"/>
+              <w:right w:w="110" w:type="dxa"/>
+            </w:tcMar>
+            <w:vAlign w:val="center"/>
+          </w:tcPr>
+          <w:p>
+            <w:pPr>
+              <w:spacing w:after="0" w:line="252" w:lineRule="auto"/>
+              <w:jc w:val="center"/>
+              <w:rPr>
+                <w:sz w:val="22"/>
+                <w:szCs w:val="22"/>
+                <w:b/>
                 <w:color w:val="000000"/>
               </w:rPr>
             </w:pPr>
@@ -2564,7 +2889,7 @@
                 <w:b/>
                 <w:color w:val="000000"/>
               </w:rPr>
-              <w:t xml:space="preserve">EG</w:t>
+              <w:t xml:space="preserve">UK</w:t>
             </w:r>
           </w:p>
         </w:tc>
@@ -2594,7 +2919,7 @@
                 <w:szCs w:val="22"/>
                 <w:color w:val="130C0E"/>
               </w:rPr>
-              <w:t xml:space="preserve">Earth Grid (Substation)</w:t>
+              <w:t xml:space="preserve">Unknown Services</w:t>
             </w:r>
           </w:p>
         </w:tc>

</xml_diff>

<commit_message>
fix(templates): heal sign-off image tag broken by a Word re-save
Word's re-save of the photo template merged the three sign-off runs into one
text run, so the image module could no longer isolate the signature image tag
("raw tag not in paragraph") and report generation failed.

- Patched photo-report.docx in place: the signature image tag now sits alone in
  its own paragraph, with the conditional markers on their own paragraphs — a
  structure that survives Word merging adjacent runs. Preserves the rest of the
  Word-saved file.
- Updated both generators to emit the same robust structure; regenerated
  service-location.docx.

Verified with a real docxtemplater render of both templates (including the
signature) — both render cleanly.
</commit_message>
<xml_diff>
--- a/public/templates/photo-report.docx
+++ b/public/templates/photo-report.docx
@@ -3392,8 +3392,23 @@
         </w:rPr>
         <w:t xml:space="preserve">SIGNATURE : </w:t>
       </w:r>
-      <w:r>
-        <w:t>{#hasSign}{%signImage}{/hasSign}</w:t>
+    </w:p>
+    <w:p>
+      <w:r>
+        <w:t>{#hasSign}</w:t>
+      </w:r>
+    </w:p>
+    <w:p>
+      <w:pPr>
+        <w:spacing w:before="40"/>
+      </w:pPr>
+      <w:r>
+        <w:t xml:space="preserve">{%signImage}</w:t>
+      </w:r>
+    </w:p>
+    <w:p>
+      <w:r>
+        <w:t>{/hasSign}</w:t>
       </w:r>
     </w:p>
     <w:sectPr>

</xml_diff>

<commit_message>
fix(pothole-report): remove legend page, smaller single pothole, visible upload spinner
- Removed the "Utility legend — DIT specification" + "Quality levels explained
  (AS 5488.1:2022)" page from the photo report generator, so it stops coming
  back every time the template is regenerated. The utility colours/codes still
  appear on the cover's Utilities-located table.
- Single-pothole image reduced 20% (480x360 -> 384x288) so it's clearly smaller
  than the main area photo.
- Loading spinner now reliably visible while attachments upload:
  - Added a "Adding photo(s)…" indicator to the Photo report's MAIN photo upload
    (it previously had none).
  - All upload spinners (main photos, potholes, service-report photos) are now
    held for a minimum ~450ms so fast uploads still show the animation.
</commit_message>
<xml_diff>
--- a/public/templates/photo-report.docx
+++ b/public/templates/photo-report.docx
@@ -2088,1016 +2088,6 @@
           <w:color w:val="130C0E"/>
         </w:rPr>
         <w:t xml:space="preserve">{comments}</w:t>
-      </w:r>
-    </w:p>
-    <w:p>
-      <w:pPr>
-        <w:pageBreakBefore/>
-        <w:pBdr>
-          <w:left w:val="single" w:sz="36" w:space="8" w:color="FFC20E"/>
-        </w:pBdr>
-        <w:spacing w:before="220" w:after="90"/>
-        <w:rPr>
-          <w:sz w:val="26"/>
-          <w:szCs w:val="26"/>
-          <w:b/>
-          <w:color w:val="130C0E"/>
-        </w:rPr>
-      </w:pPr>
-      <w:r>
-        <w:rPr>
-          <w:sz w:val="26"/>
-          <w:szCs w:val="26"/>
-          <w:b/>
-          <w:color w:val="130C0E"/>
-        </w:rPr>
-        <w:t xml:space="preserve">Utility legend — DIT specification</w:t>
-      </w:r>
-    </w:p>
-    <w:tbl>
-      <w:tblPr>
-        <w:tblW w:w="10086" w:type="dxa"/>
-        <w:jc w:val="left"/>
-        <w:tblInd w:w="0" w:type="dxa"/>
-        <w:tblBorders>
-          <w:top w:val="single" w:sz="4" w:space="0" w:color="E6E3DD"/>
-          <w:left w:val="single" w:sz="4" w:space="0" w:color="E6E3DD"/>
-          <w:bottom w:val="single" w:sz="4" w:space="0" w:color="E6E3DD"/>
-          <w:right w:val="single" w:sz="4" w:space="0" w:color="E6E3DD"/>
-          <w:insideH w:val="single" w:sz="4" w:space="0" w:color="E6E3DD"/>
-          <w:insideV w:val="single" w:sz="4" w:space="0" w:color="E6E3DD"/>
-        </w:tblBorders>
-      </w:tblPr>
-      <w:tblGrid>
-        <w:gridCol w:w="1900"/>
-        <w:gridCol w:w="8186"/>
-      </w:tblGrid>
-      <w:tr>
-        <w:tc>
-          <w:tcPr>
-            <w:tcW w:w="1900" w:type="dxa"/>
-            <w:shd w:val="clear" w:color="auto" w:fill="A6A6A6"/>
-            <w:tcMar>
-              <w:top w:w="40" w:type="dxa"/>
-              <w:left w:w="110" w:type="dxa"/>
-              <w:bottom w:w="40" w:type="dxa"/>
-              <w:right w:w="110" w:type="dxa"/>
-            </w:tcMar>
-            <w:vAlign w:val="center"/>
-          </w:tcPr>
-          <w:p>
-            <w:pPr>
-              <w:spacing w:after="0" w:line="252" w:lineRule="auto"/>
-              <w:jc w:val="center"/>
-              <w:rPr>
-                <w:sz w:val="22"/>
-                <w:szCs w:val="22"/>
-                <w:b/>
-                <w:color w:val="000000"/>
-              </w:rPr>
-            </w:pPr>
-            <w:r>
-              <w:rPr>
-                <w:sz w:val="22"/>
-                <w:szCs w:val="22"/>
-                <w:b/>
-                <w:color w:val="000000"/>
-              </w:rPr>
-              <w:t xml:space="preserve">CAD</w:t>
-            </w:r>
-          </w:p>
-        </w:tc>
-        <w:tc>
-          <w:tcPr>
-            <w:tcW w:w="8186" w:type="dxa"/>
-            <w:tcMar>
-              <w:top w:w="40" w:type="dxa"/>
-              <w:left w:w="110" w:type="dxa"/>
-              <w:bottom w:w="40" w:type="dxa"/>
-              <w:right w:w="110" w:type="dxa"/>
-            </w:tcMar>
-            <w:vAlign w:val="center"/>
-          </w:tcPr>
-          <w:p>
-            <w:pPr>
-              <w:spacing w:after="0" w:line="252" w:lineRule="auto"/>
-              <w:rPr>
-                <w:sz w:val="22"/>
-                <w:szCs w:val="22"/>
-                <w:color w:val="130C0E"/>
-              </w:rPr>
-            </w:pPr>
-            <w:r>
-              <w:rPr>
-                <w:sz w:val="22"/>
-                <w:szCs w:val="22"/>
-                <w:color w:val="130C0E"/>
-              </w:rPr>
-              <w:t xml:space="preserve">Cadastral Boundaries</w:t>
-            </w:r>
-          </w:p>
-        </w:tc>
-      </w:tr>
-      <w:tr>
-        <w:tc>
-          <w:tcPr>
-            <w:tcW w:w="1900" w:type="dxa"/>
-            <w:shd w:val="clear" w:color="auto" w:fill="2E75B6"/>
-            <w:tcMar>
-              <w:top w:w="40" w:type="dxa"/>
-              <w:left w:w="110" w:type="dxa"/>
-              <w:bottom w:w="40" w:type="dxa"/>
-              <w:right w:w="110" w:type="dxa"/>
-            </w:tcMar>
-            <w:vAlign w:val="center"/>
-          </w:tcPr>
-          <w:p>
-            <w:pPr>
-              <w:spacing w:after="0" w:line="252" w:lineRule="auto"/>
-              <w:jc w:val="center"/>
-              <w:rPr>
-                <w:sz w:val="22"/>
-                <w:szCs w:val="22"/>
-                <w:b/>
-                <w:color w:val="FFFFFF"/>
-              </w:rPr>
-            </w:pPr>
-            <w:r>
-              <w:rPr>
-                <w:sz w:val="22"/>
-                <w:szCs w:val="22"/>
-                <w:b/>
-                <w:color w:val="FFFFFF"/>
-              </w:rPr>
-              <w:t xml:space="preserve">WS, WM, W</w:t>
-            </w:r>
-          </w:p>
-        </w:tc>
-        <w:tc>
-          <w:tcPr>
-            <w:tcW w:w="8186" w:type="dxa"/>
-            <w:tcMar>
-              <w:top w:w="40" w:type="dxa"/>
-              <w:left w:w="110" w:type="dxa"/>
-              <w:bottom w:w="40" w:type="dxa"/>
-              <w:right w:w="110" w:type="dxa"/>
-            </w:tcMar>
-            <w:vAlign w:val="center"/>
-          </w:tcPr>
-          <w:p>
-            <w:pPr>
-              <w:spacing w:after="0" w:line="252" w:lineRule="auto"/>
-              <w:rPr>
-                <w:sz w:val="22"/>
-                <w:szCs w:val="22"/>
-                <w:color w:val="130C0E"/>
-              </w:rPr>
-            </w:pPr>
-            <w:r>
-              <w:rPr>
-                <w:sz w:val="22"/>
-                <w:szCs w:val="22"/>
-                <w:color w:val="130C0E"/>
-              </w:rPr>
-              <w:t xml:space="preserve">Potable Water Supply</w:t>
-            </w:r>
-          </w:p>
-        </w:tc>
-      </w:tr>
-      <w:tr>
-        <w:tc>
-          <w:tcPr>
-            <w:tcW w:w="1900" w:type="dxa"/>
-            <w:shd w:val="clear" w:color="auto" w:fill="00B050"/>
-            <w:tcMar>
-              <w:top w:w="40" w:type="dxa"/>
-              <w:left w:w="110" w:type="dxa"/>
-              <w:bottom w:w="40" w:type="dxa"/>
-              <w:right w:w="110" w:type="dxa"/>
-            </w:tcMar>
-            <w:vAlign w:val="center"/>
-          </w:tcPr>
-          <w:p>
-            <w:pPr>
-              <w:spacing w:after="0" w:line="252" w:lineRule="auto"/>
-              <w:jc w:val="center"/>
-              <w:rPr>
-                <w:sz w:val="22"/>
-                <w:szCs w:val="22"/>
-                <w:b/>
-                <w:color w:val="FFFFFF"/>
-              </w:rPr>
-            </w:pPr>
-            <w:r>
-              <w:rPr>
-                <w:sz w:val="22"/>
-                <w:szCs w:val="22"/>
-                <w:b/>
-                <w:color w:val="FFFFFF"/>
-              </w:rPr>
-              <w:t xml:space="preserve">STW</w:t>
-            </w:r>
-          </w:p>
-        </w:tc>
-        <w:tc>
-          <w:tcPr>
-            <w:tcW w:w="8186" w:type="dxa"/>
-            <w:tcMar>
-              <w:top w:w="40" w:type="dxa"/>
-              <w:left w:w="110" w:type="dxa"/>
-              <w:bottom w:w="40" w:type="dxa"/>
-              <w:right w:w="110" w:type="dxa"/>
-            </w:tcMar>
-            <w:vAlign w:val="center"/>
-          </w:tcPr>
-          <w:p>
-            <w:pPr>
-              <w:spacing w:after="0" w:line="252" w:lineRule="auto"/>
-              <w:rPr>
-                <w:sz w:val="22"/>
-                <w:szCs w:val="22"/>
-                <w:color w:val="130C0E"/>
-              </w:rPr>
-            </w:pPr>
-            <w:r>
-              <w:rPr>
-                <w:sz w:val="22"/>
-                <w:szCs w:val="22"/>
-                <w:color w:val="130C0E"/>
-              </w:rPr>
-              <w:t xml:space="preserve">Storm Water</w:t>
-            </w:r>
-          </w:p>
-        </w:tc>
-      </w:tr>
-      <w:tr>
-        <w:tc>
-          <w:tcPr>
-            <w:tcW w:w="1900" w:type="dxa"/>
-            <w:shd w:val="clear" w:color="auto" w:fill="F2E2C4"/>
-            <w:tcMar>
-              <w:top w:w="40" w:type="dxa"/>
-              <w:left w:w="110" w:type="dxa"/>
-              <w:bottom w:w="40" w:type="dxa"/>
-              <w:right w:w="110" w:type="dxa"/>
-            </w:tcMar>
-            <w:vAlign w:val="center"/>
-          </w:tcPr>
-          <w:p>
-            <w:pPr>
-              <w:spacing w:after="0" w:line="252" w:lineRule="auto"/>
-              <w:jc w:val="center"/>
-              <w:rPr>
-                <w:sz w:val="22"/>
-                <w:szCs w:val="22"/>
-                <w:b/>
-                <w:color w:val="000000"/>
-              </w:rPr>
-            </w:pPr>
-            <w:r>
-              <w:rPr>
-                <w:sz w:val="22"/>
-                <w:szCs w:val="22"/>
-                <w:b/>
-                <w:color w:val="000000"/>
-              </w:rPr>
-              <w:t xml:space="preserve">SWR</w:t>
-            </w:r>
-          </w:p>
-        </w:tc>
-        <w:tc>
-          <w:tcPr>
-            <w:tcW w:w="8186" w:type="dxa"/>
-            <w:tcMar>
-              <w:top w:w="40" w:type="dxa"/>
-              <w:left w:w="110" w:type="dxa"/>
-              <w:bottom w:w="40" w:type="dxa"/>
-              <w:right w:w="110" w:type="dxa"/>
-            </w:tcMar>
-            <w:vAlign w:val="center"/>
-          </w:tcPr>
-          <w:p>
-            <w:pPr>
-              <w:spacing w:after="0" w:line="252" w:lineRule="auto"/>
-              <w:rPr>
-                <w:sz w:val="22"/>
-                <w:szCs w:val="22"/>
-                <w:color w:val="130C0E"/>
-              </w:rPr>
-            </w:pPr>
-            <w:r>
-              <w:rPr>
-                <w:sz w:val="22"/>
-                <w:szCs w:val="22"/>
-                <w:color w:val="130C0E"/>
-              </w:rPr>
-              <w:t xml:space="preserve">Sewerage</w:t>
-            </w:r>
-          </w:p>
-        </w:tc>
-      </w:tr>
-      <w:tr>
-        <w:tc>
-          <w:tcPr>
-            <w:tcW w:w="1900" w:type="dxa"/>
-            <w:shd w:val="clear" w:color="auto" w:fill="7030A0"/>
-            <w:tcMar>
-              <w:top w:w="40" w:type="dxa"/>
-              <w:left w:w="110" w:type="dxa"/>
-              <w:bottom w:w="40" w:type="dxa"/>
-              <w:right w:w="110" w:type="dxa"/>
-            </w:tcMar>
-            <w:vAlign w:val="center"/>
-          </w:tcPr>
-          <w:p>
-            <w:pPr>
-              <w:spacing w:after="0" w:line="252" w:lineRule="auto"/>
-              <w:jc w:val="center"/>
-              <w:rPr>
-                <w:sz w:val="22"/>
-                <w:szCs w:val="22"/>
-                <w:b/>
-                <w:color w:val="FFFFFF"/>
-              </w:rPr>
-            </w:pPr>
-            <w:r>
-              <w:rPr>
-                <w:sz w:val="22"/>
-                <w:szCs w:val="22"/>
-                <w:b/>
-                <w:color w:val="FFFFFF"/>
-              </w:rPr>
-              <w:t xml:space="preserve">RW</w:t>
-            </w:r>
-          </w:p>
-        </w:tc>
-        <w:tc>
-          <w:tcPr>
-            <w:tcW w:w="8186" w:type="dxa"/>
-            <w:tcMar>
-              <w:top w:w="40" w:type="dxa"/>
-              <w:left w:w="110" w:type="dxa"/>
-              <w:bottom w:w="40" w:type="dxa"/>
-              <w:right w:w="110" w:type="dxa"/>
-            </w:tcMar>
-            <w:vAlign w:val="center"/>
-          </w:tcPr>
-          <w:p>
-            <w:pPr>
-              <w:spacing w:after="0" w:line="252" w:lineRule="auto"/>
-              <w:rPr>
-                <w:sz w:val="22"/>
-                <w:szCs w:val="22"/>
-                <w:color w:val="130C0E"/>
-              </w:rPr>
-            </w:pPr>
-            <w:r>
-              <w:rPr>
-                <w:sz w:val="22"/>
-                <w:szCs w:val="22"/>
-                <w:color w:val="130C0E"/>
-              </w:rPr>
-              <w:t xml:space="preserve">Reclaimed Water</w:t>
-            </w:r>
-          </w:p>
-        </w:tc>
-      </w:tr>
-      <w:tr>
-        <w:tc>
-          <w:tcPr>
-            <w:tcW w:w="1900" w:type="dxa"/>
-            <w:shd w:val="clear" w:color="auto" w:fill="FFFFFF"/>
-            <w:tcMar>
-              <w:top w:w="40" w:type="dxa"/>
-              <w:left w:w="110" w:type="dxa"/>
-              <w:bottom w:w="40" w:type="dxa"/>
-              <w:right w:w="110" w:type="dxa"/>
-            </w:tcMar>
-            <w:vAlign w:val="center"/>
-          </w:tcPr>
-          <w:p>
-            <w:pPr>
-              <w:spacing w:after="0" w:line="252" w:lineRule="auto"/>
-              <w:jc w:val="center"/>
-              <w:rPr>
-                <w:sz w:val="22"/>
-                <w:szCs w:val="22"/>
-                <w:b/>
-                <w:color w:val="000000"/>
-              </w:rPr>
-            </w:pPr>
-            <w:r>
-              <w:rPr>
-                <w:sz w:val="22"/>
-                <w:szCs w:val="22"/>
-                <w:b/>
-                <w:color w:val="000000"/>
-              </w:rPr>
-              <w:t xml:space="preserve">COMMS</w:t>
-            </w:r>
-          </w:p>
-        </w:tc>
-        <w:tc>
-          <w:tcPr>
-            <w:tcW w:w="8186" w:type="dxa"/>
-            <w:tcMar>
-              <w:top w:w="40" w:type="dxa"/>
-              <w:left w:w="110" w:type="dxa"/>
-              <w:bottom w:w="40" w:type="dxa"/>
-              <w:right w:w="110" w:type="dxa"/>
-            </w:tcMar>
-            <w:vAlign w:val="center"/>
-          </w:tcPr>
-          <w:p>
-            <w:pPr>
-              <w:spacing w:after="0" w:line="252" w:lineRule="auto"/>
-              <w:rPr>
-                <w:sz w:val="22"/>
-                <w:szCs w:val="22"/>
-                <w:color w:val="130C0E"/>
-              </w:rPr>
-            </w:pPr>
-            <w:r>
-              <w:rPr>
-                <w:sz w:val="22"/>
-                <w:szCs w:val="22"/>
-                <w:color w:val="130C0E"/>
-              </w:rPr>
-              <w:t xml:space="preserve">Communications</w:t>
-            </w:r>
-          </w:p>
-        </w:tc>
-      </w:tr>
-      <w:tr>
-        <w:tc>
-          <w:tcPr>
-            <w:tcW w:w="1900" w:type="dxa"/>
-            <w:shd w:val="clear" w:color="auto" w:fill="FF0000"/>
-            <w:tcMar>
-              <w:top w:w="40" w:type="dxa"/>
-              <w:left w:w="110" w:type="dxa"/>
-              <w:bottom w:w="40" w:type="dxa"/>
-              <w:right w:w="110" w:type="dxa"/>
-            </w:tcMar>
-            <w:vAlign w:val="center"/>
-          </w:tcPr>
-          <w:p>
-            <w:pPr>
-              <w:spacing w:after="0" w:line="252" w:lineRule="auto"/>
-              <w:jc w:val="center"/>
-              <w:rPr>
-                <w:sz w:val="22"/>
-                <w:szCs w:val="22"/>
-                <w:b/>
-                <w:color w:val="FFFFFF"/>
-              </w:rPr>
-            </w:pPr>
-            <w:r>
-              <w:rPr>
-                <w:sz w:val="22"/>
-                <w:szCs w:val="22"/>
-                <w:b/>
-                <w:color w:val="FFFFFF"/>
-              </w:rPr>
-              <w:t xml:space="preserve">FS</w:t>
-            </w:r>
-          </w:p>
-        </w:tc>
-        <w:tc>
-          <w:tcPr>
-            <w:tcW w:w="8186" w:type="dxa"/>
-            <w:tcMar>
-              <w:top w:w="40" w:type="dxa"/>
-              <w:left w:w="110" w:type="dxa"/>
-              <w:bottom w:w="40" w:type="dxa"/>
-              <w:right w:w="110" w:type="dxa"/>
-            </w:tcMar>
-            <w:vAlign w:val="center"/>
-          </w:tcPr>
-          <w:p>
-            <w:pPr>
-              <w:spacing w:after="0" w:line="252" w:lineRule="auto"/>
-              <w:rPr>
-                <w:sz w:val="22"/>
-                <w:szCs w:val="22"/>
-                <w:color w:val="130C0E"/>
-              </w:rPr>
-            </w:pPr>
-            <w:r>
-              <w:rPr>
-                <w:sz w:val="22"/>
-                <w:szCs w:val="22"/>
-                <w:color w:val="130C0E"/>
-              </w:rPr>
-              <w:t xml:space="preserve">Fire Service</w:t>
-            </w:r>
-          </w:p>
-        </w:tc>
-      </w:tr>
-      <w:tr>
-        <w:tc>
-          <w:tcPr>
-            <w:tcW w:w="1900" w:type="dxa"/>
-            <w:shd w:val="clear" w:color="auto" w:fill="ED7D31"/>
-            <w:tcMar>
-              <w:top w:w="40" w:type="dxa"/>
-              <w:left w:w="110" w:type="dxa"/>
-              <w:bottom w:w="40" w:type="dxa"/>
-              <w:right w:w="110" w:type="dxa"/>
-            </w:tcMar>
-            <w:vAlign w:val="center"/>
-          </w:tcPr>
-          <w:p>
-            <w:pPr>
-              <w:spacing w:after="0" w:line="252" w:lineRule="auto"/>
-              <w:jc w:val="center"/>
-              <w:rPr>
-                <w:sz w:val="22"/>
-                <w:szCs w:val="22"/>
-                <w:b/>
-                <w:color w:val="000000"/>
-              </w:rPr>
-            </w:pPr>
-            <w:r>
-              <w:rPr>
-                <w:sz w:val="22"/>
-                <w:szCs w:val="22"/>
-                <w:b/>
-                <w:color w:val="000000"/>
-              </w:rPr>
-              <w:t xml:space="preserve">HV, LV, E</w:t>
-            </w:r>
-          </w:p>
-        </w:tc>
-        <w:tc>
-          <w:tcPr>
-            <w:tcW w:w="8186" w:type="dxa"/>
-            <w:tcMar>
-              <w:top w:w="40" w:type="dxa"/>
-              <w:left w:w="110" w:type="dxa"/>
-              <w:bottom w:w="40" w:type="dxa"/>
-              <w:right w:w="110" w:type="dxa"/>
-            </w:tcMar>
-            <w:vAlign w:val="center"/>
-          </w:tcPr>
-          <w:p>
-            <w:pPr>
-              <w:spacing w:after="0" w:line="252" w:lineRule="auto"/>
-              <w:rPr>
-                <w:sz w:val="22"/>
-                <w:szCs w:val="22"/>
-                <w:color w:val="130C0E"/>
-              </w:rPr>
-            </w:pPr>
-            <w:r>
-              <w:rPr>
-                <w:sz w:val="22"/>
-                <w:szCs w:val="22"/>
-                <w:color w:val="130C0E"/>
-              </w:rPr>
-              <w:t xml:space="preserve">Electrical</w:t>
-            </w:r>
-          </w:p>
-        </w:tc>
-      </w:tr>
-      <w:tr>
-        <w:tc>
-          <w:tcPr>
-            <w:tcW w:w="1900" w:type="dxa"/>
-            <w:shd w:val="clear" w:color="auto" w:fill="FFD500"/>
-            <w:tcMar>
-              <w:top w:w="40" w:type="dxa"/>
-              <w:left w:w="110" w:type="dxa"/>
-              <w:bottom w:w="40" w:type="dxa"/>
-              <w:right w:w="110" w:type="dxa"/>
-            </w:tcMar>
-            <w:vAlign w:val="center"/>
-          </w:tcPr>
-          <w:p>
-            <w:pPr>
-              <w:spacing w:after="0" w:line="252" w:lineRule="auto"/>
-              <w:jc w:val="center"/>
-              <w:rPr>
-                <w:sz w:val="22"/>
-                <w:szCs w:val="22"/>
-                <w:b/>
-                <w:color w:val="000000"/>
-              </w:rPr>
-            </w:pPr>
-            <w:r>
-              <w:rPr>
-                <w:sz w:val="22"/>
-                <w:szCs w:val="22"/>
-                <w:b/>
-                <w:color w:val="000000"/>
-              </w:rPr>
-              <w:t xml:space="preserve">G, GM, GS</w:t>
-            </w:r>
-          </w:p>
-        </w:tc>
-        <w:tc>
-          <w:tcPr>
-            <w:tcW w:w="8186" w:type="dxa"/>
-            <w:tcMar>
-              <w:top w:w="40" w:type="dxa"/>
-              <w:left w:w="110" w:type="dxa"/>
-              <w:bottom w:w="40" w:type="dxa"/>
-              <w:right w:w="110" w:type="dxa"/>
-            </w:tcMar>
-            <w:vAlign w:val="center"/>
-          </w:tcPr>
-          <w:p>
-            <w:pPr>
-              <w:spacing w:after="0" w:line="252" w:lineRule="auto"/>
-              <w:rPr>
-                <w:sz w:val="22"/>
-                <w:szCs w:val="22"/>
-                <w:color w:val="130C0E"/>
-              </w:rPr>
-            </w:pPr>
-            <w:r>
-              <w:rPr>
-                <w:sz w:val="22"/>
-                <w:szCs w:val="22"/>
-                <w:color w:val="130C0E"/>
-              </w:rPr>
-              <w:t xml:space="preserve">Gas</w:t>
-            </w:r>
-          </w:p>
-        </w:tc>
-      </w:tr>
-      <w:tr>
-        <w:tc>
-          <w:tcPr>
-            <w:tcW w:w="1900" w:type="dxa"/>
-            <w:shd w:val="clear" w:color="auto" w:fill="974706"/>
-            <w:tcMar>
-              <w:top w:w="40" w:type="dxa"/>
-              <w:left w:w="110" w:type="dxa"/>
-              <w:bottom w:w="40" w:type="dxa"/>
-              <w:right w:w="110" w:type="dxa"/>
-            </w:tcMar>
-            <w:vAlign w:val="center"/>
-          </w:tcPr>
-          <w:p>
-            <w:pPr>
-              <w:spacing w:after="0" w:line="252" w:lineRule="auto"/>
-              <w:jc w:val="center"/>
-              <w:rPr>
-                <w:sz w:val="22"/>
-                <w:szCs w:val="22"/>
-                <w:b/>
-                <w:color w:val="FFFFFF"/>
-              </w:rPr>
-            </w:pPr>
-            <w:r>
-              <w:rPr>
-                <w:sz w:val="22"/>
-                <w:szCs w:val="22"/>
-                <w:b/>
-                <w:color w:val="FFFFFF"/>
-              </w:rPr>
-              <w:t xml:space="preserve">P</w:t>
-            </w:r>
-          </w:p>
-        </w:tc>
-        <w:tc>
-          <w:tcPr>
-            <w:tcW w:w="8186" w:type="dxa"/>
-            <w:tcMar>
-              <w:top w:w="40" w:type="dxa"/>
-              <w:left w:w="110" w:type="dxa"/>
-              <w:bottom w:w="40" w:type="dxa"/>
-              <w:right w:w="110" w:type="dxa"/>
-            </w:tcMar>
-            <w:vAlign w:val="center"/>
-          </w:tcPr>
-          <w:p>
-            <w:pPr>
-              <w:spacing w:after="0" w:line="252" w:lineRule="auto"/>
-              <w:rPr>
-                <w:sz w:val="22"/>
-                <w:szCs w:val="22"/>
-                <w:color w:val="130C0E"/>
-              </w:rPr>
-            </w:pPr>
-            <w:r>
-              <w:rPr>
-                <w:sz w:val="22"/>
-                <w:szCs w:val="22"/>
-                <w:color w:val="130C0E"/>
-              </w:rPr>
-              <w:t xml:space="preserve">Petroleum</w:t>
-            </w:r>
-          </w:p>
-        </w:tc>
-      </w:tr>
-      <w:tr>
-        <w:tc>
-          <w:tcPr>
-            <w:tcW w:w="1900" w:type="dxa"/>
-            <w:shd w:val="clear" w:color="auto" w:fill="375623"/>
-            <w:tcMar>
-              <w:top w:w="40" w:type="dxa"/>
-              <w:left w:w="110" w:type="dxa"/>
-              <w:bottom w:w="40" w:type="dxa"/>
-              <w:right w:w="110" w:type="dxa"/>
-            </w:tcMar>
-            <w:vAlign w:val="center"/>
-          </w:tcPr>
-          <w:p>
-            <w:pPr>
-              <w:spacing w:after="0" w:line="252" w:lineRule="auto"/>
-              <w:jc w:val="center"/>
-              <w:rPr>
-                <w:sz w:val="22"/>
-                <w:szCs w:val="22"/>
-                <w:b/>
-                <w:color w:val="FFFFFF"/>
-              </w:rPr>
-            </w:pPr>
-            <w:r>
-              <w:rPr>
-                <w:sz w:val="22"/>
-                <w:szCs w:val="22"/>
-                <w:b/>
-                <w:color w:val="FFFFFF"/>
-              </w:rPr>
-              <w:t xml:space="preserve">RET</w:t>
-            </w:r>
-          </w:p>
-        </w:tc>
-        <w:tc>
-          <w:tcPr>
-            <w:tcW w:w="8186" w:type="dxa"/>
-            <w:tcMar>
-              <w:top w:w="40" w:type="dxa"/>
-              <w:left w:w="110" w:type="dxa"/>
-              <w:bottom w:w="40" w:type="dxa"/>
-              <w:right w:w="110" w:type="dxa"/>
-            </w:tcMar>
-            <w:vAlign w:val="center"/>
-          </w:tcPr>
-          <w:p>
-            <w:pPr>
-              <w:spacing w:after="0" w:line="252" w:lineRule="auto"/>
-              <w:rPr>
-                <w:sz w:val="22"/>
-                <w:szCs w:val="22"/>
-                <w:color w:val="130C0E"/>
-              </w:rPr>
-            </w:pPr>
-            <w:r>
-              <w:rPr>
-                <w:sz w:val="22"/>
-                <w:szCs w:val="22"/>
-                <w:color w:val="130C0E"/>
-              </w:rPr>
-              <w:t xml:space="preserve">Reticulation</w:t>
-            </w:r>
-          </w:p>
-        </w:tc>
-      </w:tr>
-      <w:tr>
-        <w:tc>
-          <w:tcPr>
-            <w:tcW w:w="1900" w:type="dxa"/>
-            <w:shd w:val="clear" w:color="auto" w:fill="FF66CC"/>
-            <w:tcMar>
-              <w:top w:w="40" w:type="dxa"/>
-              <w:left w:w="110" w:type="dxa"/>
-              <w:bottom w:w="40" w:type="dxa"/>
-              <w:right w:w="110" w:type="dxa"/>
-            </w:tcMar>
-            <w:vAlign w:val="center"/>
-          </w:tcPr>
-          <w:p>
-            <w:pPr>
-              <w:spacing w:after="0" w:line="252" w:lineRule="auto"/>
-              <w:jc w:val="center"/>
-              <w:rPr>
-                <w:sz w:val="22"/>
-                <w:szCs w:val="22"/>
-                <w:b/>
-                <w:color w:val="000000"/>
-              </w:rPr>
-            </w:pPr>
-            <w:r>
-              <w:rPr>
-                <w:sz w:val="22"/>
-                <w:szCs w:val="22"/>
-                <w:b/>
-                <w:color w:val="000000"/>
-              </w:rPr>
-              <w:t xml:space="preserve">UK</w:t>
-            </w:r>
-          </w:p>
-        </w:tc>
-        <w:tc>
-          <w:tcPr>
-            <w:tcW w:w="8186" w:type="dxa"/>
-            <w:tcMar>
-              <w:top w:w="40" w:type="dxa"/>
-              <w:left w:w="110" w:type="dxa"/>
-              <w:bottom w:w="40" w:type="dxa"/>
-              <w:right w:w="110" w:type="dxa"/>
-            </w:tcMar>
-            <w:vAlign w:val="center"/>
-          </w:tcPr>
-          <w:p>
-            <w:pPr>
-              <w:spacing w:after="0" w:line="252" w:lineRule="auto"/>
-              <w:rPr>
-                <w:sz w:val="22"/>
-                <w:szCs w:val="22"/>
-                <w:color w:val="130C0E"/>
-              </w:rPr>
-            </w:pPr>
-            <w:r>
-              <w:rPr>
-                <w:sz w:val="22"/>
-                <w:szCs w:val="22"/>
-                <w:color w:val="130C0E"/>
-              </w:rPr>
-              <w:t xml:space="preserve">Unknown Services</w:t>
-            </w:r>
-          </w:p>
-        </w:tc>
-      </w:tr>
-    </w:tbl>
-    <w:p>
-      <w:pPr>
-        <w:pBdr>
-          <w:left w:val="single" w:sz="36" w:space="8" w:color="FFC20E"/>
-        </w:pBdr>
-        <w:spacing w:before="220" w:after="90"/>
-        <w:rPr>
-          <w:sz w:val="26"/>
-          <w:szCs w:val="26"/>
-          <w:b/>
-          <w:color w:val="130C0E"/>
-        </w:rPr>
-      </w:pPr>
-      <w:r>
-        <w:rPr>
-          <w:sz w:val="26"/>
-          <w:szCs w:val="26"/>
-          <w:b/>
-          <w:color w:val="130C0E"/>
-        </w:rPr>
-        <w:t xml:space="preserve">Quality levels explained (AS 5488.1:2022)</w:t>
-      </w:r>
-    </w:p>
-    <w:p>
-      <w:pPr>
-        <w:spacing w:after="0" w:line="252" w:lineRule="auto"/>
-        <w:rPr>
-          <w:sz w:val="23"/>
-          <w:szCs w:val="23"/>
-          <w:b/>
-          <w:color w:val="130C0E"/>
-        </w:rPr>
-      </w:pPr>
-      <w:r>
-        <w:rPr>
-          <w:sz w:val="23"/>
-          <w:szCs w:val="23"/>
-          <w:b/>
-          <w:color w:val="130C0E"/>
-        </w:rPr>
-        <w:t xml:space="preserve">Quality Level A (QL-A)</w:t>
-      </w:r>
-    </w:p>
-    <w:p>
-      <w:pPr>
-        <w:spacing w:after="0" w:line="252" w:lineRule="auto"/>
-        <w:rPr>
-          <w:sz w:val="21"/>
-          <w:szCs w:val="21"/>
-          <w:color w:val="333333"/>
-        </w:rPr>
-      </w:pPr>
-      <w:r>
-        <w:rPr>
-          <w:sz w:val="21"/>
-          <w:szCs w:val="21"/>
-          <w:color w:val="333333"/>
-        </w:rPr>
-        <w:t xml:space="preserve">Is the highest Quality level accuracy and consists of positive identification of the attribute and location of a subsurface position in three dimensions. It is the only Quality level that defines a subsurface utility has been validated with additional attribute information (e.g. size, material, depth).</w:t>
-      </w:r>
-    </w:p>
-    <w:p>
-      <w:pPr>
-        <w:spacing w:after="0" w:line="252" w:lineRule="auto"/>
-        <w:rPr>
-          <w:sz w:val="23"/>
-          <w:szCs w:val="23"/>
-          <w:b/>
-          <w:color w:val="130C0E"/>
-        </w:rPr>
-      </w:pPr>
-      <w:r>
-        <w:rPr>
-          <w:sz w:val="23"/>
-          <w:szCs w:val="23"/>
-          <w:b/>
-          <w:color w:val="130C0E"/>
-        </w:rPr>
-        <w:t xml:space="preserve">Quality Level B (QL-B)</w:t>
-      </w:r>
-    </w:p>
-    <w:p>
-      <w:pPr>
-        <w:spacing w:after="0" w:line="252" w:lineRule="auto"/>
-        <w:rPr>
-          <w:sz w:val="21"/>
-          <w:szCs w:val="21"/>
-          <w:color w:val="333333"/>
-        </w:rPr>
-      </w:pPr>
-      <w:r>
-        <w:rPr>
-          <w:sz w:val="21"/>
-          <w:szCs w:val="21"/>
-          <w:color w:val="333333"/>
-        </w:rPr>
-        <w:t xml:space="preserve">A Quality level that provides relative spatial position of the subsurface utility that has been located in three dimensions (horizontal +/- 300mm and vertical +/- 500mm) by tracing with EMI. Tracing has been achieved by applying an electromagnetic signal along or within the utility and traced to a known or visible end point.</w:t>
-      </w:r>
-    </w:p>
-    <w:p>
-      <w:pPr>
-        <w:spacing w:after="0" w:line="252" w:lineRule="auto"/>
-        <w:rPr>
-          <w:sz w:val="23"/>
-          <w:szCs w:val="23"/>
-          <w:b/>
-          <w:color w:val="130C0E"/>
-        </w:rPr>
-      </w:pPr>
-      <w:r>
-        <w:rPr>
-          <w:sz w:val="23"/>
-          <w:szCs w:val="23"/>
-          <w:b/>
-          <w:color w:val="130C0E"/>
-        </w:rPr>
-        <w:t xml:space="preserve">Quality Level C (QL-C)</w:t>
-      </w:r>
-    </w:p>
-    <w:p>
-      <w:pPr>
-        <w:spacing w:after="0" w:line="252" w:lineRule="auto"/>
-        <w:rPr>
-          <w:sz w:val="21"/>
-          <w:szCs w:val="21"/>
-          <w:color w:val="333333"/>
-        </w:rPr>
-      </w:pPr>
-      <w:r>
-        <w:rPr>
-          <w:sz w:val="21"/>
-          <w:szCs w:val="21"/>
-          <w:color w:val="333333"/>
-        </w:rPr>
-        <w:t xml:space="preserve">Surface feature correlation or an interpretation of the approximate location and attributes of a subsurface utility asset using a combination of existing records and a site survey of visible surface features such as marker plates or utility lids. GPR can be used to improve and refine the relative spatial position of a QL-C alignment.</w:t>
-      </w:r>
-    </w:p>
-    <w:p>
-      <w:pPr>
-        <w:spacing w:after="0" w:line="252" w:lineRule="auto"/>
-        <w:rPr>
-          <w:sz w:val="23"/>
-          <w:szCs w:val="23"/>
-          <w:b/>
-          <w:color w:val="130C0E"/>
-        </w:rPr>
-      </w:pPr>
-      <w:r>
-        <w:rPr>
-          <w:sz w:val="23"/>
-          <w:szCs w:val="23"/>
-          <w:b/>
-          <w:color w:val="130C0E"/>
-        </w:rPr>
-        <w:t xml:space="preserve">Quality Level D (QL-D)</w:t>
-      </w:r>
-    </w:p>
-    <w:p>
-      <w:pPr>
-        <w:spacing w:after="0" w:line="252" w:lineRule="auto"/>
-        <w:rPr>
-          <w:sz w:val="21"/>
-          <w:szCs w:val="21"/>
-          <w:color w:val="333333"/>
-        </w:rPr>
-      </w:pPr>
-      <w:r>
-        <w:rPr>
-          <w:sz w:val="21"/>
-          <w:szCs w:val="21"/>
-          <w:color w:val="333333"/>
-        </w:rPr>
-        <w:t xml:space="preserve">Lowest of the four levels. This information can be gathered from existing Before-You-Dig plans, other available existing records and site plans, however it has not been possible to accurately locate these subsurface utilities using electromagnetic or GPR techniques within the tolerances set out in AS 5488.1:2022.</w:t>
       </w:r>
     </w:p>
     <w:p>

</xml_diff>